<commit_message>
Improve paper given suggestions from JNAFS Reviewer 2
</commit_message>
<xml_diff>
--- a/analysis/paper/_book/ms.docx
+++ b/analysis/paper/_book/ms.docx
@@ -73,7 +73,7 @@
         <w:br/>
       </w:r>
       <w:r>
-        <w:t xml:space="preserve">2025-08-29</w:t>
+        <w:t xml:space="preserve">2025-09-03</w:t>
       </w:r>
     </w:p>
     <w:p>
@@ -99,7 +99,7 @@
         <w:br/>
       </w:r>
       <w:r>
-        <w:t xml:space="preserve">Carrying capacity is a fundamental concept in ecology that has inspired the development and application of a broad range of population models. In the context of fisheries science, production models have been employed globally to calculate carrying capacity and guide the sustainable use of fish populations. Production models have, however, been criticized for failing to account for species interactions and environmental effects. We aim to fill some of these gaps by introducing a novel state-space multispecies production model. We apply our extended model to commercially important demersal fish species off the east coast of Canada to assess its ability to reveal species interactions and the relative impacts of fishing and environmental effects. Our results indicate that accounting for species interactions increases the accuracy of biomass estimates for species within a community. The model also revealed strongly correlated process deviations, unrelated to fishing or density-dependent effects, which unexpectidly indicates that widespread collapses were primarily driven by a common environmental driver rather than fishing. Such inferences indicate that this may be a promising avenue for producing more holistic and accurate assessments for multiple species with relatively minimal data requirements (time-series of landings and fisheries-independent indices). Finally, this approach may serve as a stepping stone towards an ecosystem-based approach to fisheries management.</w:t>
+        <w:t xml:space="preserve">Carrying capacity is a fundamental concept in ecology that has inspired the development and application of a broad range of population models. In the context of fisheries science, production models have been employed globally to calculate carrying capacity and guide the sustainable use of fish populations. Production models have, however, been criticized for failing to account for species interactions and environmental effects. We aim to fill some of these gaps by introducing a novel state-space multispecies production model. We apply our extended model to commercially important demersal fish species off the east coast of Canada to assess its ability to reveal species interactions and the relative impacts of fishing and environmental effects. Our results indicate that accounting for species interactions increases the accuracy of biomass estimates for species within a community. The model also revealed strongly correlated process deviations, unrelated to fishing or density-dependent effects, which unexpectedly indicates that widespread collapses were primarily driven by a common environmental driver rather than fishing. Such inferences indicate that this may be a promising avenue for producing more holistic and accurate assessments for multiple species with relatively minimal data requirements (time-series of landings and fisheries-independent indices). Finally, this approach may serve as a stepping stone towards an ecosystem-based approach to fisheries management.</w:t>
       </w:r>
       <w:r>
         <w:br/>
@@ -4359,7 +4359,7 @@
         </w:r>
       </w:hyperlink>
       <w:r>
-        <w:t xml:space="preserve">, accessed 2022-01-21) and aggregated by region, species, and year. Survey indices were derived from the standardized, stratified random bottom-trawl surveys conducted each spring and fall by DFO; this is perhaps the largest fisheries-independent survey conducted in the world, which aims to cover more than 500,000 km</w:t>
+        <w:t xml:space="preserve">, accessed 2022-01-21) and aggregated by region, species, and year. Survey indices were derived from the standardized, stratified random bottom-trawl surveys conducted each spring and fall by DFO; one of the largest fisheries-independent surveys in the world, covering more than 500,000 km</w:t>
       </w:r>
       <w:r>
         <w:rPr>
@@ -4371,7 +4371,7 @@
         <w:t xml:space="preserve"> </w:t>
       </w:r>
       <w:r>
-        <w:t xml:space="preserve">annually (roughly the size of Sweden or the Yukon, Canada) to depth up to 1500 m. Since the inception of this program in 1971, survey platforms and protocols have undergone a series of changes that affect the continuity of the data collected in each region and season. A Yankee then Engel otter trawl, with nets designed to catch large demersal fish, were used between 1971 to 1994. Starting in the fall of 1995 survey gear was changed to a Campelen shrimp trawl with a small mesh codend, which allowed a broader range of species and size groups to be captured</w:t>
+        <w:t xml:space="preserve">annually (roughly the size of Sweden or the Yukon, Canada) to depths up to 1500 m. Since the inception of this program in 1971, survey platforms and protocols have undergone a series of changes that affect the continuity of the data collected in each region and season. A Yankee then Engel otter trawl, with nets designed to catch large demersal fish, were used from 1971 to 1994. Starting in the fall of 1995 survey gear was changed to a Campelen shrimp trawl with a small mesh codend, which allowed a broader range of species and size groups to be captured</w:t>
       </w:r>
       <w:r>
         <w:t xml:space="preserve"> </w:t>
@@ -4720,7 +4720,7 @@
         <w:t xml:space="preserve">)</w:t>
       </w:r>
       <w:r>
-        <w:t xml:space="preserve">, 0.01 and 1 were chosen as the lower,</w:t>
+        <w:t xml:space="preserve">, 0.1 and 1 were chosen as the lower,</w:t>
       </w:r>
       <w:r>
         <w:t xml:space="preserve"> </w:t>
@@ -6358,7 +6358,7 @@
         <w:t xml:space="preserve"> </w:t>
       </w:r>
       <w:r>
-        <w:t xml:space="preserve">priors were informed by the average survey coverage by gear and season. Survey coverage within each region was computed by dividing the average spatial coverage of strata across years by the total area of all strata (i.e., average area covered / area of survey domain). Survey coverage was then multiplied by 0.2 for deep-water species (Greenland Halibut, Atlantic Halibut, Witch Flounder, Redfish spp., White Hake, Silver Hake, and Monkfish) and 0.5 for the remainder. The lower range was widened, especially for deep-water species, to account for potential gear selectivity issues</w:t>
+        <w:t xml:space="preserve">priors were informed by the average survey coverage by gear and season. Survey coverage within each region was computed by dividing the average spatial coverage of strata across years by the total area of all strata (i.e., average area covered / area of survey domain). To account for the fact that the proportion of a stock accessible to the survey may be lower than the nominal coverage, this ratio was further adjusted: multiplied by 0.2 for deep-water species (Greenland Halibut, Atlantic Halibut, Witch Flounder, Redfish spp., White Hake, Silver Hake, and Monkfish) or by 0.5 for shallower shelf-associated species. These multipliers reflect prior expectations that gear selectivity</w:t>
       </w:r>
       <w:r>
         <w:t xml:space="preserve"> </w:t>
@@ -6384,7 +6384,7 @@
         <w:t xml:space="preserve"> </w:t>
       </w:r>
       <w:r>
-        <w:t xml:space="preserve">and availability issues (e.g., portion of the stock in deeper water than covered by the survey). The upper inflection point was set to 1 as it is possible that the survey indices represent overestimates of the true population size in some instances.</w:t>
+        <w:t xml:space="preserve">reduces availability for all species, while deep-water species require an additional adjustment because a portion of the stock may occupy depths beyond the survey domain. The upper inflection point was set to 1 as it is possible that the survey indices represent overestimates of the true population size in some instances.</w:t>
       </w:r>
     </w:p>
     <w:p>
@@ -7545,7 +7545,7 @@
         <w:pStyle w:val="BodyText"/>
       </w:pPr>
       <w:r>
-        <w:t xml:space="preserve">Isolating residual changes in biomass not explained by reported fisheries landings or the production function (equation (4)) reveals substantive subtractions in the early 1990s across all three ecosystem production units (Figure</w:t>
+        <w:t xml:space="preserve">Isolating residual changes in biomass not explained by reported fisheries landings or the production function (equation (4)) highlights deviations that can be either additions (positive residuals) or subtractions (negative residuals) to total biomass (Figure</w:t>
       </w:r>
       <w:r>
         <w:t xml:space="preserve"> </w:t>
@@ -7554,7 +7554,7 @@
         <w:t xml:space="preserve">4</w:t>
       </w:r>
       <w:r>
-        <w:t xml:space="preserve">). These residual subtractions exceed the absolute scale of landings taken in the late 1980s from the Northeast NL Shelf and Grand Bank ecosystem production units. The scale of changes derived from the production function and other processes are of a scale similar to landings reported in the Southern NL ecosystem production unit. Estimates of biomass exceeded the carrying capacity estimated for the Northeast NL Shelf through the 1980s, and all focal species displayed abrupt declines in the early 1990s. Comparing community composition in the early 1980s to the 2010s, there are no clear shifts in the relative biomass of the focal species on the Northeast NL Shelf. Elsewhere, total biomass exceeded or approached system carrying capacity in the late 1980s, after which all species declined. Estimates of total biomass have gradually increased on the Grand Bank and off Southern NL since the mid 1990s, largely due to increasing Redfish spp. biomass estimates.</w:t>
+        <w:t xml:space="preserve">). Substantial additions occurred through the 1980s, followed by sharp subtractions in the early 1990s across all three ecosystem production units. On the Northeast NL Shelf, biomass exceeded the estimated carrying capacity through much of the 1980s, and residual subtractions exceeding 500 kt per year precede the abrupt declines of the early 1990s. Most species have since recovered on the Northeast NL Shelf, with total biomass approaching carrying capacity while community composition has remained largely unchanged. On the Grand Bank, total biomass only briefly exceeded carrying capacity in the 1980s and, following declines in the early 1990s, subsequent increases were dominated by Redfish spp. Off Southern NL, biomass remained below carrying capacity until the late 2010s, with smaller declines in the early 1990s and later increases largely driven by Redfish spp.</w:t>
       </w:r>
     </w:p>
     <w:p>
@@ -8483,30 +8483,98 @@
         <w:t xml:space="preserve">.</w:t>
       </w:r>
     </w:p>
-    <w:bookmarkStart w:id="37" w:name="conclusion"/>
-    <w:p>
-      <w:pPr>
-        <w:pStyle w:val="Heading2"/>
-      </w:pPr>
-      <w:r>
-        <w:t xml:space="preserve">Conclusion</w:t>
-      </w:r>
-    </w:p>
-    <w:p>
-      <w:pPr>
-        <w:pStyle w:val="FirstParagraph"/>
-      </w:pPr>
-      <w:r>
-        <w:t xml:space="preserve">Practitioners are becoming increasingly aware of the need to apply an ecosystem based fisheries management</w:t>
-      </w:r>
-      <w:r>
-        <w:t xml:space="preserve"> </w:t>
-      </w:r>
-      <w:r>
-        <w:t xml:space="preserve">(EBFM;</w:t>
-      </w:r>
-      <w:r>
-        <w:t xml:space="preserve"> </w:t>
+    <w:p>
+      <w:pPr>
+        <w:pStyle w:val="BodyText"/>
+      </w:pPr>
+      <w:r>
+        <w:t xml:space="preserve">Despite these limitations, the approach retains practical value because it relies on inputs that are routinely collected in many regions (fishery‐independent surveys and landings), making it broadly applicable in data-limited contexts. In turn, the multispecies production framework provides management-relevant outputs for ecosystem-based fisheries management (EBFM): it estimates community-level constraints (shared carrying capacity) and cross-species coherence, which can be used to design reference points and harvest control rules that recognize system-level limits and trade-offs among species</w:t>
+      </w:r>
+      <w:r>
+        <w:t xml:space="preserve"> </w:t>
+      </w:r>
+      <w:r>
+        <w:t xml:space="preserve">(</w:t>
+      </w:r>
+      <w:hyperlink w:anchor="ref-moffitt2016">
+        <w:r>
+          <w:rPr>
+            <w:rStyle w:val="Hyperlink"/>
+          </w:rPr>
+          <w:t xml:space="preserve">Moffitt et al., 2016</w:t>
+        </w:r>
+      </w:hyperlink>
+      <w:r>
+        <w:t xml:space="preserve">; sensu</w:t>
+      </w:r>
+      <w:r>
+        <w:t xml:space="preserve"> </w:t>
+      </w:r>
+      <w:hyperlink w:anchor="ref-mueter2006">
+        <w:r>
+          <w:rPr>
+            <w:rStyle w:val="Hyperlink"/>
+          </w:rPr>
+          <w:t xml:space="preserve">Mueter and Megrey, 2006</w:t>
+        </w:r>
+      </w:hyperlink>
+      <w:r>
+        <w:t xml:space="preserve">)</w:t>
+      </w:r>
+      <w:r>
+        <w:t xml:space="preserve">. When residual dynamics become more synchronous, managers can apply stronger precautionary buffers to account for weaker portfolio effects</w:t>
+      </w:r>
+      <w:r>
+        <w:t xml:space="preserve"> </w:t>
+      </w:r>
+      <w:r>
+        <w:t xml:space="preserve">(</w:t>
+      </w:r>
+      <w:hyperlink w:anchor="ref-schindler2010">
+        <w:r>
+          <w:rPr>
+            <w:rStyle w:val="Hyperlink"/>
+          </w:rPr>
+          <w:t xml:space="preserve">Schindler et al., 2010</w:t>
+        </w:r>
+      </w:hyperlink>
+      <w:r>
+        <w:t xml:space="preserve">)</w:t>
+      </w:r>
+      <w:r>
+        <w:t xml:space="preserve">. The model can also support projections conditioned on community dynamics, useful for testing rebuilding trade-offs. Because it is lightweight relative to end-to-end ecosystem models</w:t>
+      </w:r>
+      <w:r>
+        <w:t xml:space="preserve"> </w:t>
+      </w:r>
+      <w:r>
+        <w:t xml:space="preserve">(e.g.,</w:t>
+      </w:r>
+      <w:r>
+        <w:t xml:space="preserve"> </w:t>
+      </w:r>
+      <w:hyperlink w:anchor="ref-fulton2011">
+        <w:r>
+          <w:rPr>
+            <w:rStyle w:val="Hyperlink"/>
+          </w:rPr>
+          <w:t xml:space="preserve">Fulton et al., 2011</w:t>
+        </w:r>
+      </w:hyperlink>
+      <w:r>
+        <w:t xml:space="preserve">)</w:t>
+      </w:r>
+      <w:r>
+        <w:t xml:space="preserve"> </w:t>
+      </w:r>
+      <w:r>
+        <w:t xml:space="preserve">yet consistent with key principles of EBFM</w:t>
+      </w:r>
+      <w:r>
+        <w:t xml:space="preserve"> </w:t>
+      </w:r>
+      <w:r>
+        <w:t xml:space="preserve">(</w:t>
       </w:r>
       <w:hyperlink w:anchor="ref-pikitch2004">
         <w:r>
@@ -8520,7 +8588,24 @@
         <w:t xml:space="preserve">)</w:t>
       </w:r>
       <w:r>
-        <w:t xml:space="preserve">. A robust understanding of the interactions of multiple species with each other and their environment is a critical prerequisite for advancing a EBFM. There are multiple analytical pathways to support such management, however, data requirements are often prohibitive</w:t>
+        <w:t xml:space="preserve">, this approach offers a tractable option to embed multispecies dynamics and environmental considerations into existing assessment and strategy-evaluation workflows.</w:t>
+      </w:r>
+    </w:p>
+    <w:bookmarkStart w:id="37" w:name="conclusion"/>
+    <w:p>
+      <w:pPr>
+        <w:pStyle w:val="Heading2"/>
+      </w:pPr>
+      <w:r>
+        <w:t xml:space="preserve">Conclusion</w:t>
+      </w:r>
+    </w:p>
+    <w:p>
+      <w:pPr>
+        <w:pStyle w:val="FirstParagraph"/>
+      </w:pPr>
+      <w:r>
+        <w:t xml:space="preserve">Practitioners are becoming increasingly aware of the need to apply EBFM</w:t>
       </w:r>
       <w:r>
         <w:t xml:space="preserve"> </w:t>
@@ -8528,19 +8613,108 @@
       <w:r>
         <w:t xml:space="preserve">(</w:t>
       </w:r>
-      <w:hyperlink w:anchor="ref-latour2003">
+      <w:hyperlink w:anchor="ref-pikitch2004">
         <w:r>
           <w:rPr>
             <w:rStyle w:val="Hyperlink"/>
           </w:rPr>
-          <w:t xml:space="preserve">Latour et al., 2003</w:t>
+          <w:t xml:space="preserve">Pikitch et al., 2004</w:t>
         </w:r>
       </w:hyperlink>
       <w:r>
         <w:t xml:space="preserve">)</w:t>
       </w:r>
       <w:r>
-        <w:t xml:space="preserve">. Our study documents a production model that can estimate the population dynamics of multiple stocks using commonly available landings and survey data. This approach enables the estimation of multispecies trends and provides an avenue for producing species-specific projections conditioned on recent community dynamics. As such, it may serve as a relatively tractable method for informing management decisions for multiple species occupying the same region. While our model has limitations, it represents a step forward in understanding the complex interactions among species in marine ecosystems and provides a framework for supporting sustainable management decisions.</w:t>
+        <w:t xml:space="preserve">; however, progress has been impeded by a series of myths</w:t>
+      </w:r>
+      <w:r>
+        <w:t xml:space="preserve"> </w:t>
+      </w:r>
+      <w:r>
+        <w:t xml:space="preserve">(</w:t>
+      </w:r>
+      <w:hyperlink w:anchor="ref-patrick2015">
+        <w:r>
+          <w:rPr>
+            <w:rStyle w:val="Hyperlink"/>
+          </w:rPr>
+          <w:t xml:space="preserve">Patrick and Link, 2015</w:t>
+        </w:r>
+      </w:hyperlink>
+      <w:r>
+        <w:t xml:space="preserve">)</w:t>
+      </w:r>
+      <w:r>
+        <w:t xml:space="preserve">. One myth is that</w:t>
+      </w:r>
+      <w:r>
+        <w:t xml:space="preserve"> </w:t>
+      </w:r>
+      <w:r>
+        <w:t xml:space="preserve">“EBFM can only be implemented in regions with copious data, and the corollary, doing EBFM requires models that are too complicated”</w:t>
+      </w:r>
+      <w:r>
+        <w:t xml:space="preserve"> </w:t>
+      </w:r>
+      <w:r>
+        <w:t xml:space="preserve">(</w:t>
+      </w:r>
+      <w:hyperlink w:anchor="ref-patrick2015">
+        <w:r>
+          <w:rPr>
+            <w:rStyle w:val="Hyperlink"/>
+          </w:rPr>
+          <w:t xml:space="preserve">Patrick and Link, 2015</w:t>
+        </w:r>
+      </w:hyperlink>
+      <w:r>
+        <w:t xml:space="preserve">)</w:t>
+      </w:r>
+      <w:r>
+        <w:t xml:space="preserve">. Our results support the arguments of</w:t>
+      </w:r>
+      <w:r>
+        <w:t xml:space="preserve"> </w:t>
+      </w:r>
+      <w:r>
+        <w:t xml:space="preserve">Patrick and Link (</w:t>
+      </w:r>
+      <w:hyperlink w:anchor="ref-patrick2015">
+        <w:r>
+          <w:rPr>
+            <w:rStyle w:val="Hyperlink"/>
+          </w:rPr>
+          <w:t xml:space="preserve">2015</w:t>
+        </w:r>
+      </w:hyperlink>
+      <w:r>
+        <w:t xml:space="preserve">)</w:t>
+      </w:r>
+      <w:r>
+        <w:t xml:space="preserve"> </w:t>
+      </w:r>
+      <w:r>
+        <w:t xml:space="preserve">that data requirements need not be prohibitive, models need not be overly complex, and perfect knowledge of every process is not required to make meaningful progress. Using standard survey and catch data, the multispecies production model presented here offers a tractable means of estimating community-level constraints and multispecies trends, as well as producing species-specific projections conditioned on recent community dynamics. As such, it provides a framework for developing reference points and testing harvest control rules that recognize trade-offs among species. Echoing earlier arguments</w:t>
+      </w:r>
+      <w:r>
+        <w:t xml:space="preserve"> </w:t>
+      </w:r>
+      <w:r>
+        <w:t xml:space="preserve">(</w:t>
+      </w:r>
+      <w:hyperlink w:anchor="ref-pikitch2004">
+        <w:r>
+          <w:rPr>
+            <w:rStyle w:val="Hyperlink"/>
+          </w:rPr>
+          <w:t xml:space="preserve">Pikitch et al., 2004</w:t>
+        </w:r>
+      </w:hyperlink>
+      <w:r>
+        <w:t xml:space="preserve">)</w:t>
+      </w:r>
+      <w:r>
+        <w:t xml:space="preserve">, EBFM can and should be advanced even where data are limited. With minimal inputs, this method may help translate ecosystem considerations into operational advice, offering pragmatic support for the implementation of EBFM.</w:t>
       </w:r>
     </w:p>
     <w:bookmarkEnd w:id="37"/>
@@ -8563,7 +8737,7 @@
       </w:r>
     </w:p>
     <w:bookmarkEnd w:id="39"/>
-    <w:bookmarkStart w:id="101" w:name="references"/>
+    <w:bookmarkStart w:id="103" w:name="references"/>
     <w:p>
       <w:pPr>
         <w:pStyle w:val="Heading1"/>
@@ -8572,7 +8746,7 @@
         <w:t xml:space="preserve">References</w:t>
       </w:r>
     </w:p>
-    <w:bookmarkStart w:id="100" w:name="refs"/>
+    <w:bookmarkStart w:id="102" w:name="refs"/>
     <w:bookmarkStart w:id="40" w:name="ref-albertsen2018"/>
     <w:p>
       <w:pPr>
@@ -9303,7 +9477,30 @@
       </w:r>
     </w:p>
     <w:bookmarkEnd w:id="70"/>
-    <w:bookmarkStart w:id="71" w:name="ref-montevecchi1997"/>
+    <w:bookmarkStart w:id="71" w:name="ref-moffitt2016"/>
+    <w:p>
+      <w:pPr>
+        <w:pStyle w:val="Bibliography"/>
+      </w:pPr>
+      <w:r>
+        <w:t xml:space="preserve">Moffitt, E.A., Punt, A.E., Holsman, K., Aydin, K.Y., Ianelli, J.N., Ortiz, I., 2016. Moving towards ecosystem-based fisheries management: Options for parameterizing multi-species biological reference points.</w:t>
+      </w:r>
+      <w:r>
+        <w:t xml:space="preserve"> </w:t>
+      </w:r>
+      <w:r>
+        <w:rPr>
+          <w:i/>
+          <w:iCs/>
+        </w:rPr>
+        <w:t xml:space="preserve">Deep Sea Research Part II: Topical Studies in Oceanography</w:t>
+      </w:r>
+      <w:r>
+        <w:t xml:space="preserve">, 134: 350–359.</w:t>
+      </w:r>
+    </w:p>
+    <w:bookmarkEnd w:id="71"/>
+    <w:bookmarkStart w:id="72" w:name="ref-montevecchi1997"/>
     <w:p>
       <w:pPr>
         <w:pStyle w:val="Bibliography"/>
@@ -9325,8 +9522,8 @@
         <w:t xml:space="preserve">, 54: 608–614.</w:t>
       </w:r>
     </w:p>
-    <w:bookmarkEnd w:id="71"/>
-    <w:bookmarkStart w:id="72" w:name="ref-morgan2002"/>
+    <w:bookmarkEnd w:id="72"/>
+    <w:bookmarkStart w:id="73" w:name="ref-morgan2002"/>
     <w:p>
       <w:pPr>
         <w:pStyle w:val="Bibliography"/>
@@ -9348,8 +9545,8 @@
         <w:t xml:space="preserve">, 57: 39–49.</w:t>
       </w:r>
     </w:p>
-    <w:bookmarkEnd w:id="72"/>
-    <w:bookmarkStart w:id="73" w:name="ref-mueter2006"/>
+    <w:bookmarkEnd w:id="73"/>
+    <w:bookmarkStart w:id="74" w:name="ref-mueter2006"/>
     <w:p>
       <w:pPr>
         <w:pStyle w:val="Bibliography"/>
@@ -9371,8 +9568,8 @@
         <w:t xml:space="preserve">, 81: 189–201.</w:t>
       </w:r>
     </w:p>
-    <w:bookmarkEnd w:id="73"/>
-    <w:bookmarkStart w:id="74" w:name="ref-mullowney2014"/>
+    <w:bookmarkEnd w:id="74"/>
+    <w:bookmarkStart w:id="75" w:name="ref-mullowney2014"/>
     <w:p>
       <w:pPr>
         <w:pStyle w:val="Bibliography"/>
@@ -9394,8 +9591,8 @@
         <w:t xml:space="preserve">, 71: 784–793.</w:t>
       </w:r>
     </w:p>
-    <w:bookmarkEnd w:id="74"/>
-    <w:bookmarkStart w:id="76" w:name="ref-nafo2019"/>
+    <w:bookmarkEnd w:id="75"/>
+    <w:bookmarkStart w:id="77" w:name="ref-nafo2019"/>
     <w:p>
       <w:pPr>
         <w:pStyle w:val="Bibliography"/>
@@ -9406,7 +9603,7 @@
       <w:r>
         <w:t xml:space="preserve"> </w:t>
       </w:r>
-      <w:hyperlink r:id="rId75">
+      <w:hyperlink r:id="rId76">
         <w:r>
           <w:rPr>
             <w:rStyle w:val="Hyperlink"/>
@@ -9431,8 +9628,31 @@
         <w:t xml:space="preserve">, 19/20.</w:t>
       </w:r>
     </w:p>
-    <w:bookmarkEnd w:id="76"/>
-    <w:bookmarkStart w:id="77" w:name="ref-pauly2021"/>
+    <w:bookmarkEnd w:id="77"/>
+    <w:bookmarkStart w:id="78" w:name="ref-patrick2015"/>
+    <w:p>
+      <w:pPr>
+        <w:pStyle w:val="Bibliography"/>
+      </w:pPr>
+      <w:r>
+        <w:t xml:space="preserve">Patrick, W.S., Link, J.S., 2015. Myths that continue to impede progress in ecosystem-based fisheries management.</w:t>
+      </w:r>
+      <w:r>
+        <w:t xml:space="preserve"> </w:t>
+      </w:r>
+      <w:r>
+        <w:rPr>
+          <w:i/>
+          <w:iCs/>
+        </w:rPr>
+        <w:t xml:space="preserve">Fisheries</w:t>
+      </w:r>
+      <w:r>
+        <w:t xml:space="preserve">, 40: 155–160.</w:t>
+      </w:r>
+    </w:p>
+    <w:bookmarkEnd w:id="78"/>
+    <w:bookmarkStart w:id="79" w:name="ref-pauly2021"/>
     <w:p>
       <w:pPr>
         <w:pStyle w:val="Bibliography"/>
@@ -9454,8 +9674,8 @@
         <w:t xml:space="preserve">, 78: 2204–2210.</w:t>
       </w:r>
     </w:p>
-    <w:bookmarkEnd w:id="77"/>
-    <w:bookmarkStart w:id="78" w:name="ref-pedersen2017"/>
+    <w:bookmarkEnd w:id="79"/>
+    <w:bookmarkStart w:id="80" w:name="ref-pedersen2017"/>
     <w:p>
       <w:pPr>
         <w:pStyle w:val="Bibliography"/>
@@ -9477,8 +9697,8 @@
         <w:t xml:space="preserve">, 4: 170215.</w:t>
       </w:r>
     </w:p>
-    <w:bookmarkEnd w:id="78"/>
-    <w:bookmarkStart w:id="79" w:name="ref-pepin2014"/>
+    <w:bookmarkEnd w:id="80"/>
+    <w:bookmarkStart w:id="81" w:name="ref-pepin2014"/>
     <w:p>
       <w:pPr>
         <w:pStyle w:val="Bibliography"/>
@@ -9521,8 +9741,8 @@
         <w:t xml:space="preserve">, 14: 069.</w:t>
       </w:r>
     </w:p>
-    <w:bookmarkEnd w:id="79"/>
-    <w:bookmarkStart w:id="80" w:name="ref-pikitch2004"/>
+    <w:bookmarkEnd w:id="81"/>
+    <w:bookmarkStart w:id="82" w:name="ref-pikitch2004"/>
     <w:p>
       <w:pPr>
         <w:pStyle w:val="Bibliography"/>
@@ -9531,8 +9751,8 @@
         <w:t xml:space="preserve">Pikitch, E.K., Santora, C., Babcock, E.A., Bakun, A., Bonfil, R., Conover, D.O., Dayton, P., Doukakis, P., Fluharty, D., Heneman, B., others, 2004. Ecosystem-based fishery management. Science.</w:t>
       </w:r>
     </w:p>
-    <w:bookmarkEnd w:id="80"/>
-    <w:bookmarkStart w:id="81" w:name="ref-pinsky2021"/>
+    <w:bookmarkEnd w:id="82"/>
+    <w:bookmarkStart w:id="83" w:name="ref-pinsky2021"/>
     <w:p>
       <w:pPr>
         <w:pStyle w:val="Bibliography"/>
@@ -9563,8 +9783,8 @@
         <w:t xml:space="preserve">, 118: e2025453118.</w:t>
       </w:r>
     </w:p>
-    <w:bookmarkEnd w:id="81"/>
-    <w:bookmarkStart w:id="83" w:name="ref-R"/>
+    <w:bookmarkEnd w:id="83"/>
+    <w:bookmarkStart w:id="85" w:name="ref-R"/>
     <w:p>
       <w:pPr>
         <w:pStyle w:val="Bibliography"/>
@@ -9575,7 +9795,7 @@
       <w:r>
         <w:t xml:space="preserve"> </w:t>
       </w:r>
-      <w:hyperlink r:id="rId82">
+      <w:hyperlink r:id="rId84">
         <w:r>
           <w:rPr>
             <w:rStyle w:val="Hyperlink"/>
@@ -9587,8 +9807,8 @@
         <w:t xml:space="preserve">. R Foundation for Statistical Computing, Vienna, Austria.</w:t>
       </w:r>
     </w:p>
-    <w:bookmarkEnd w:id="83"/>
-    <w:bookmarkStart w:id="85" w:name="ref-regular2022"/>
+    <w:bookmarkEnd w:id="85"/>
+    <w:bookmarkStart w:id="87" w:name="ref-regular2022"/>
     <w:p>
       <w:pPr>
         <w:pStyle w:val="Bibliography"/>
@@ -9609,7 +9829,7 @@
       <w:r>
         <w:t xml:space="preserve">, 247: 106180. https://doi.org/</w:t>
       </w:r>
-      <w:hyperlink r:id="rId84">
+      <w:hyperlink r:id="rId86">
         <w:r>
           <w:rPr>
             <w:rStyle w:val="Hyperlink"/>
@@ -9618,8 +9838,8 @@
         </w:r>
       </w:hyperlink>
     </w:p>
-    <w:bookmarkEnd w:id="85"/>
-    <w:bookmarkStart w:id="86" w:name="ref-robertson2021"/>
+    <w:bookmarkEnd w:id="87"/>
+    <w:bookmarkStart w:id="88" w:name="ref-robertson2021"/>
     <w:p>
       <w:pPr>
         <w:pStyle w:val="Bibliography"/>
@@ -9641,8 +9861,8 @@
         <w:t xml:space="preserve">, 11: 9513.</w:t>
       </w:r>
     </w:p>
-    <w:bookmarkEnd w:id="86"/>
-    <w:bookmarkStart w:id="87" w:name="ref-rose2004"/>
+    <w:bookmarkEnd w:id="88"/>
+    <w:bookmarkStart w:id="89" w:name="ref-rose2004"/>
     <w:p>
       <w:pPr>
         <w:pStyle w:val="Bibliography"/>
@@ -9690,8 +9910,8 @@
         <w:t xml:space="preserve">, 61: 1553–1557.</w:t>
       </w:r>
     </w:p>
-    <w:bookmarkEnd w:id="87"/>
-    <w:bookmarkStart w:id="88" w:name="ref-rose2000"/>
+    <w:bookmarkEnd w:id="89"/>
+    <w:bookmarkStart w:id="90" w:name="ref-rose2000"/>
     <w:p>
       <w:pPr>
         <w:pStyle w:val="Bibliography"/>
@@ -9723,8 +9943,8 @@
         <w:t xml:space="preserve">, 57: 644–663.</w:t>
       </w:r>
     </w:p>
-    <w:bookmarkEnd w:id="88"/>
-    <w:bookmarkStart w:id="89" w:name="ref-schaefer1954"/>
+    <w:bookmarkEnd w:id="90"/>
+    <w:bookmarkStart w:id="91" w:name="ref-schaefer1954"/>
     <w:p>
       <w:pPr>
         <w:pStyle w:val="Bibliography"/>
@@ -9746,8 +9966,8 @@
         <w:t xml:space="preserve">, 1: 23–56.</w:t>
       </w:r>
     </w:p>
-    <w:bookmarkEnd w:id="89"/>
-    <w:bookmarkStart w:id="90" w:name="ref-scheffer2015"/>
+    <w:bookmarkEnd w:id="91"/>
+    <w:bookmarkStart w:id="92" w:name="ref-scheffer2015"/>
     <w:p>
       <w:pPr>
         <w:pStyle w:val="Bibliography"/>
@@ -9769,8 +9989,8 @@
         <w:t xml:space="preserve">, 347: 1317–1319.</w:t>
       </w:r>
     </w:p>
-    <w:bookmarkEnd w:id="90"/>
-    <w:bookmarkStart w:id="91" w:name="ref-scheffer2003"/>
+    <w:bookmarkEnd w:id="92"/>
+    <w:bookmarkStart w:id="93" w:name="ref-scheffer2003"/>
     <w:p>
       <w:pPr>
         <w:pStyle w:val="Bibliography"/>
@@ -9792,8 +10012,8 @@
         <w:t xml:space="preserve">, 491: 9–18.</w:t>
       </w:r>
     </w:p>
-    <w:bookmarkEnd w:id="91"/>
-    <w:bookmarkStart w:id="92" w:name="ref-schijns2021"/>
+    <w:bookmarkEnd w:id="93"/>
+    <w:bookmarkStart w:id="94" w:name="ref-schijns2021"/>
     <w:p>
       <w:pPr>
         <w:pStyle w:val="Bibliography"/>
@@ -9815,8 +10035,8 @@
         <w:t xml:space="preserve">, 78: 2675–2683.</w:t>
       </w:r>
     </w:p>
-    <w:bookmarkEnd w:id="92"/>
-    <w:bookmarkStart w:id="93" w:name="ref-schindler2010"/>
+    <w:bookmarkEnd w:id="94"/>
+    <w:bookmarkStart w:id="95" w:name="ref-schindler2010"/>
     <w:p>
       <w:pPr>
         <w:pStyle w:val="Bibliography"/>
@@ -9838,8 +10058,8 @@
         <w:t xml:space="preserve">, 465: 609–612.</w:t>
       </w:r>
     </w:p>
-    <w:bookmarkEnd w:id="93"/>
-    <w:bookmarkStart w:id="94" w:name="ref-smith1981"/>
+    <w:bookmarkEnd w:id="95"/>
+    <w:bookmarkStart w:id="96" w:name="ref-smith1981"/>
     <w:p>
       <w:pPr>
         <w:pStyle w:val="Bibliography"/>
@@ -9857,8 +10077,8 @@
         <w:t xml:space="preserve">. Canadian Technical Report of Fisheries; Aquatic Sciences No. 1030.</w:t>
       </w:r>
     </w:p>
-    <w:bookmarkEnd w:id="94"/>
-    <w:bookmarkStart w:id="95" w:name="ref-templeman1962"/>
+    <w:bookmarkEnd w:id="96"/>
+    <w:bookmarkStart w:id="97" w:name="ref-templeman1962"/>
     <w:p>
       <w:pPr>
         <w:pStyle w:val="Bibliography"/>
@@ -9880,8 +10100,8 @@
         <w:t xml:space="preserve">, 3: 79–123.</w:t>
       </w:r>
     </w:p>
-    <w:bookmarkEnd w:id="95"/>
-    <w:bookmarkStart w:id="96" w:name="ref-thorson2020"/>
+    <w:bookmarkEnd w:id="97"/>
+    <w:bookmarkStart w:id="98" w:name="ref-thorson2020"/>
     <w:p>
       <w:pPr>
         <w:pStyle w:val="Bibliography"/>
@@ -9903,8 +10123,8 @@
         <w:t xml:space="preserve">, 21: 237–251.</w:t>
       </w:r>
     </w:p>
-    <w:bookmarkEnd w:id="96"/>
-    <w:bookmarkStart w:id="97" w:name="ref-volterra1926"/>
+    <w:bookmarkEnd w:id="98"/>
+    <w:bookmarkStart w:id="99" w:name="ref-volterra1926"/>
     <w:p>
       <w:pPr>
         <w:pStyle w:val="Bibliography"/>
@@ -9926,8 +10146,8 @@
         <w:t xml:space="preserve">, 118: 558–560.</w:t>
       </w:r>
     </w:p>
-    <w:bookmarkEnd w:id="97"/>
-    <w:bookmarkStart w:id="98" w:name="ref-walsh1992"/>
+    <w:bookmarkEnd w:id="99"/>
+    <w:bookmarkStart w:id="100" w:name="ref-walsh1992"/>
     <w:p>
       <w:pPr>
         <w:pStyle w:val="Bibliography"/>
@@ -9949,8 +10169,8 @@
         <w:t xml:space="preserve">, 12: 625–633.</w:t>
       </w:r>
     </w:p>
-    <w:bookmarkEnd w:id="98"/>
-    <w:bookmarkStart w:id="99" w:name="ref-winker2018"/>
+    <w:bookmarkEnd w:id="100"/>
+    <w:bookmarkStart w:id="101" w:name="ref-winker2018"/>
     <w:p>
       <w:pPr>
         <w:pStyle w:val="Bibliography"/>
@@ -9981,15 +10201,15 @@
         <w:t xml:space="preserve">, 204: 275–288.</w:t>
       </w:r>
     </w:p>
-    <w:bookmarkEnd w:id="99"/>
-    <w:bookmarkEnd w:id="100"/>
+    <w:bookmarkEnd w:id="101"/>
+    <w:bookmarkEnd w:id="102"/>
     <w:p>
       <w:r>
         <w:br w:type="page"/>
       </w:r>
     </w:p>
-    <w:bookmarkEnd w:id="101"/>
-    <w:bookmarkStart w:id="122" w:name="figures"/>
+    <w:bookmarkEnd w:id="103"/>
+    <w:bookmarkStart w:id="124" w:name="figures"/>
     <w:p>
       <w:pPr>
         <w:pStyle w:val="Heading1"/>
@@ -10007,18 +10227,18 @@
           <wp:inline>
             <wp:extent cx="3599999" cy="4092857"/>
             <wp:effectExtent b="0" l="0" r="0" t="0"/>
-            <wp:docPr descr="Fig 1: Map of Newfoundland and Labrador (NL) case study area showing the Northeast NL Shelf (purple), Grand Bank (green), and Southern NL (yellow) ecosystem production units." title="" id="103" name="Picture"/>
+            <wp:docPr descr="Fig 1: Map of Newfoundland and Labrador (NL) case study area showing the Northeast NL Shelf (purple), Grand Bank (green), and Southern NL (yellow) ecosystem production units." title="" id="105" name="Picture"/>
             <a:graphic>
               <a:graphicData uri="http://schemas.openxmlformats.org/drawingml/2006/picture">
                 <pic:pic>
                   <pic:nvPicPr>
-                    <pic:cNvPr descr="C:/Users/RegularP/Documents/PROJECTS/multispic/analysis/paper/figures/epu_map.png" id="104" name="Picture"/>
+                    <pic:cNvPr descr="C:/Users/RegularP/Documents/PROJECTS/multispic/analysis/paper/figures/epu_map.png" id="106" name="Picture"/>
                     <pic:cNvPicPr>
                       <a:picLocks noChangeArrowheads="1" noChangeAspect="1"/>
                     </pic:cNvPicPr>
                   </pic:nvPicPr>
                   <pic:blipFill>
-                    <a:blip r:embed="rId102"/>
+                    <a:blip r:embed="rId104"/>
                     <a:stretch>
                       <a:fillRect/>
                     </a:stretch>
@@ -10049,8 +10269,8 @@
       <w:pPr>
         <w:pStyle w:val="ImageCaption"/>
       </w:pPr>
-      <w:bookmarkStart w:id="105" w:name="fig:epu-map"/>
-      <w:bookmarkEnd w:id="105"/>
+      <w:bookmarkStart w:id="107" w:name="fig:epu-map"/>
+      <w:bookmarkEnd w:id="107"/>
       <w:r>
         <w:t xml:space="preserve">Fig 1: Map of Newfoundland and Labrador (NL) case study area showing the Northeast NL Shelf (purple), Grand Bank (green), and Southern NL (yellow) ecosystem production units.</w:t>
       </w:r>
@@ -10064,12 +10284,12 @@
           <wp:inline>
             <wp:extent cx="5943600" cy="2773680"/>
             <wp:effectExtent b="0" l="0" r="0" t="0"/>
-            <wp:docPr descr="Fig 2: LOO-CV and Hindcast-CV scores from a series of production model formulations of increasing complexity, from a single-species production model (“Single-species”) to a multispecies production model with a covariate effect and species and temporal correlations (“Full”), fit to seven species in three ecosystem production units (Northeast NL Shelf, Grand Bank, and Southern NL) off the east coast of Canada. Overall scores for each model across score type and ecosystem production unit are shown on the rightmost facet." title="" id="107" name="Picture"/>
+            <wp:docPr descr="Fig 2: LOO-CV and Hindcast-CV scores from a series of production model formulations of increasing complexity, from a single-species production model (“Single-species”) to a multispecies production model with a covariate effect and species and temporal correlations (“Full”), fit to seven species in three ecosystem production units (Northeast NL Shelf, Grand Bank, and Southern NL) off the east coast of Canada. Overall scores for each model across score type and ecosystem production unit are shown on the rightmost facet." title="" id="109" name="Picture"/>
             <a:graphic>
               <a:graphicData uri="http://schemas.openxmlformats.org/drawingml/2006/picture">
                 <pic:pic>
                   <pic:nvPicPr>
-                    <pic:cNvPr descr="C:/Users/RegularP/Documents/PROJECTS/multispic/analysis/paper/figures/scores.svg" id="108" name="Picture"/>
+                    <pic:cNvPr descr="C:/Users/RegularP/Documents/PROJECTS/multispic/analysis/paper/figures/scores.svg" id="110" name="Picture"/>
                     <pic:cNvPicPr>
                       <a:picLocks noChangeArrowheads="1" noChangeAspect="1"/>
                     </pic:cNvPicPr>
@@ -10081,7 +10301,7 @@
                           <a14:useLocalDpi xmlns:a14="http://schemas.microsoft.com/office/drawing/2010/main" val="0"/>
                         </a:ext>
                         <a:ext uri="{96DAC541-7B7A-43D3-8B79-37D633B846F1}">
-                          <asvg:svgBlip xmlns:asvg="http://schemas.microsoft.com/office/drawing/2016/SVG/main" r:embed="rId106"/>
+                          <asvg:svgBlip xmlns:asvg="http://schemas.microsoft.com/office/drawing/2016/SVG/main" r:embed="rId108"/>
                         </a:ext>
                       </a:extLst>
                     </a:blip>
@@ -10115,8 +10335,8 @@
       <w:pPr>
         <w:pStyle w:val="ImageCaption"/>
       </w:pPr>
-      <w:bookmarkStart w:id="109" w:name="fig:scores"/>
-      <w:bookmarkEnd w:id="109"/>
+      <w:bookmarkStart w:id="111" w:name="fig:scores"/>
+      <w:bookmarkEnd w:id="111"/>
       <w:r>
         <w:t xml:space="preserve">Fig 2: LOO-CV and Hindcast-CV scores from a series of production model formulations of increasing complexity, from a single-species production model (</w:t>
       </w:r>
@@ -10142,12 +10362,12 @@
           <wp:inline>
             <wp:extent cx="5943600" cy="4160520"/>
             <wp:effectExtent b="0" l="0" r="0" t="0"/>
-            <wp:docPr descr="Fig 3: Trends in survey indices (dots) along with predicted indices (thin lines) and model estimates of biomass from the best fitting multispecies production model (thick lines). Uncertainty in the biomass estimates are represented by 95% confidence intervals (shaded region). Results from three ecosystem production units (Northeast NL Shelf, Grand Bank, and Southern NL) off the east coast of Canada are presented. Though data from seven species were used in each region, the species facet is limited to four for simplicity. Differences in biomass estimates from the indices stem from differing survey catchability estimates. Note differences in scale across facets." title="" id="111" name="Picture"/>
+            <wp:docPr descr="Fig 3: Trends in survey indices (dots) along with predicted indices (thin lines) and model estimates of biomass from the best fitting multispecies production model (thick lines). Uncertainty in the biomass estimates are represented by 95% confidence intervals (shaded region). Results from three ecosystem production units (Northeast NL Shelf, Grand Bank, and Southern NL) off the east coast of Canada are presented. Though data from seven species were used in each region, the species facet is limited to four for simplicity. Differences in biomass estimates from the indices stem from differing survey catchability estimates. Note differences in scale across facets." title="" id="113" name="Picture"/>
             <a:graphic>
               <a:graphicData uri="http://schemas.openxmlformats.org/drawingml/2006/picture">
                 <pic:pic>
                   <pic:nvPicPr>
-                    <pic:cNvPr descr="C:/Users/RegularP/Documents/PROJECTS/multispic/analysis/paper/figures/survey_trends.svg" id="112" name="Picture"/>
+                    <pic:cNvPr descr="C:/Users/RegularP/Documents/PROJECTS/multispic/analysis/paper/figures/survey_trends.svg" id="114" name="Picture"/>
                     <pic:cNvPicPr>
                       <a:picLocks noChangeArrowheads="1" noChangeAspect="1"/>
                     </pic:cNvPicPr>
@@ -10159,7 +10379,7 @@
                           <a14:useLocalDpi xmlns:a14="http://schemas.microsoft.com/office/drawing/2010/main" val="0"/>
                         </a:ext>
                         <a:ext uri="{96DAC541-7B7A-43D3-8B79-37D633B846F1}">
-                          <asvg:svgBlip xmlns:asvg="http://schemas.microsoft.com/office/drawing/2016/SVG/main" r:embed="rId110"/>
+                          <asvg:svgBlip xmlns:asvg="http://schemas.microsoft.com/office/drawing/2016/SVG/main" r:embed="rId112"/>
                         </a:ext>
                       </a:extLst>
                     </a:blip>
@@ -10193,8 +10413,8 @@
       <w:pPr>
         <w:pStyle w:val="ImageCaption"/>
       </w:pPr>
-      <w:bookmarkStart w:id="113" w:name="fig:survey-trends"/>
-      <w:bookmarkEnd w:id="113"/>
+      <w:bookmarkStart w:id="115" w:name="fig:survey-trends"/>
+      <w:bookmarkEnd w:id="115"/>
       <w:r>
         <w:t xml:space="preserve">Fig 3: Trends in survey indices (dots) along with predicted indices (thin lines) and model estimates of biomass from the best fitting multispecies production model (thick lines). Uncertainty in the biomass estimates are represented by 95% confidence intervals (shaded region). Results from three ecosystem production units (Northeast NL Shelf, Grand Bank, and Southern NL) off the east coast of Canada are presented. Though data from seven species were used in each region, the species facet is limited to four for simplicity. Differences in biomass estimates from the indices stem from differing survey catchability estimates. Note differences in scale across facets.</w:t>
       </w:r>
@@ -10208,12 +10428,12 @@
           <wp:inline>
             <wp:extent cx="5943600" cy="4160520"/>
             <wp:effectExtent b="0" l="0" r="0" t="0"/>
-            <wp:docPr descr="Fig 4: Trends in biomass, expected production, reported landings, and residual change from the best fitting multispecies production model across three ecosystem production units (Northeast NL Shelf, Grand Bank, and Southern NL) off the east coast of Canada. Species-specific trends from a subset of species are shown along with totals including seven species. Expected production represents expected changes from intrinsic growth and density-dependence (i.e., change from the production equation) and residual change represent process errors not explained by the production equation or reported landings. Note difference in scale across facets." title="" id="115" name="Picture"/>
+            <wp:docPr descr="Fig 4: Trends in biomass, expected production, reported landings, and residual change from the best fitting multispecies production model across three ecosystem production units (Northeast NL Shelf, Grand Bank, and Southern NL) off the east coast of Canada. Species-specific trends from a subset of species are shown along with totals including seven species. Expected production represents expected changes from intrinsic growth and density-dependence (i.e., change from the production equation) and residual change represent process errors not explained by the production equation or reported landings. Note difference in scale across facets." title="" id="117" name="Picture"/>
             <a:graphic>
               <a:graphicData uri="http://schemas.openxmlformats.org/drawingml/2006/picture">
                 <pic:pic>
                   <pic:nvPicPr>
-                    <pic:cNvPr descr="C:/Users/RegularP/Documents/PROJECTS/multispic/analysis/paper/figures/pop_trends.svg" id="116" name="Picture"/>
+                    <pic:cNvPr descr="C:/Users/RegularP/Documents/PROJECTS/multispic/analysis/paper/figures/pop_trends.svg" id="118" name="Picture"/>
                     <pic:cNvPicPr>
                       <a:picLocks noChangeArrowheads="1" noChangeAspect="1"/>
                     </pic:cNvPicPr>
@@ -10225,7 +10445,7 @@
                           <a14:useLocalDpi xmlns:a14="http://schemas.microsoft.com/office/drawing/2010/main" val="0"/>
                         </a:ext>
                         <a:ext uri="{96DAC541-7B7A-43D3-8B79-37D633B846F1}">
-                          <asvg:svgBlip xmlns:asvg="http://schemas.microsoft.com/office/drawing/2016/SVG/main" r:embed="rId114"/>
+                          <asvg:svgBlip xmlns:asvg="http://schemas.microsoft.com/office/drawing/2016/SVG/main" r:embed="rId116"/>
                         </a:ext>
                       </a:extLst>
                     </a:blip>
@@ -10259,8 +10479,8 @@
       <w:pPr>
         <w:pStyle w:val="ImageCaption"/>
       </w:pPr>
-      <w:bookmarkStart w:id="117" w:name="fig:pop-trends"/>
-      <w:bookmarkEnd w:id="117"/>
+      <w:bookmarkStart w:id="119" w:name="fig:pop-trends"/>
+      <w:bookmarkEnd w:id="119"/>
       <w:r>
         <w:t xml:space="preserve">Fig 4: Trends in biomass, expected production, reported landings, and residual change from the best fitting multispecies production model across three ecosystem production units (Northeast NL Shelf, Grand Bank, and Southern NL) off the east coast of Canada. Species-specific trends from a subset of species are shown along with totals including seven species. Expected production represents expected changes from intrinsic growth and density-dependence (i.e., change from the production equation) and residual change represent process errors not explained by the production equation or reported landings. Note difference in scale across facets.</w:t>
       </w:r>
@@ -10274,12 +10494,12 @@
           <wp:inline>
             <wp:extent cx="5943600" cy="3200400"/>
             <wp:effectExtent b="0" l="0" r="0" t="0"/>
-            <wp:docPr descr="Fig 5: Trends (upper facet) and species-to-species correlations (lower facet) in standardized process errors from the best fitting multispecies production model applied to seven species within three ecosystem production units (Northeast NL Shelf, Grand Bank, and Southern NL) off the east coast of Canada. Process errors represent changes not explained by the production equation or reported landings. Points in the correlation plots are coloured and scaled by the level of species-to-species correlation, \rho." title="" id="119" name="Picture"/>
+            <wp:docPr descr="Fig 5: Trends (upper facet) and species-to-species correlations (lower facet) in standardized process errors from the best fitting multispecies production model applied to seven species within three ecosystem production units (Northeast NL Shelf, Grand Bank, and Southern NL) off the east coast of Canada. Process errors represent changes not explained by the production equation or reported landings. Points in the correlation plots are coloured and scaled by the level of species-to-species correlation, \rho." title="" id="121" name="Picture"/>
             <a:graphic>
               <a:graphicData uri="http://schemas.openxmlformats.org/drawingml/2006/picture">
                 <pic:pic>
                   <pic:nvPicPr>
-                    <pic:cNvPr descr="C:/Users/RegularP/Documents/PROJECTS/multispic/analysis/paper/figures/pe_cor.svg" id="120" name="Picture"/>
+                    <pic:cNvPr descr="C:/Users/RegularP/Documents/PROJECTS/multispic/analysis/paper/figures/pe_cor.svg" id="122" name="Picture"/>
                     <pic:cNvPicPr>
                       <a:picLocks noChangeArrowheads="1" noChangeAspect="1"/>
                     </pic:cNvPicPr>
@@ -10291,7 +10511,7 @@
                           <a14:useLocalDpi xmlns:a14="http://schemas.microsoft.com/office/drawing/2010/main" val="0"/>
                         </a:ext>
                         <a:ext uri="{96DAC541-7B7A-43D3-8B79-37D633B846F1}">
-                          <asvg:svgBlip xmlns:asvg="http://schemas.microsoft.com/office/drawing/2016/SVG/main" r:embed="rId118"/>
+                          <asvg:svgBlip xmlns:asvg="http://schemas.microsoft.com/office/drawing/2016/SVG/main" r:embed="rId120"/>
                         </a:ext>
                       </a:extLst>
                     </a:blip>
@@ -10325,8 +10545,8 @@
       <w:pPr>
         <w:pStyle w:val="ImageCaption"/>
       </w:pPr>
-      <w:bookmarkStart w:id="121" w:name="fig:pe-cor"/>
-      <w:bookmarkEnd w:id="121"/>
+      <w:bookmarkStart w:id="123" w:name="fig:pe-cor"/>
+      <w:bookmarkEnd w:id="123"/>
       <w:r>
         <w:t xml:space="preserve">Fig 5: Trends (upper facet) and species-to-species correlations (lower facet) in standardized process errors from the best fitting multispecies production model applied to seven species within three ecosystem production units (Northeast NL Shelf, Grand Bank, and Southern NL) off the east coast of Canada. Process errors represent changes not explained by the production equation or reported landings. Points in the correlation plots are coloured and scaled by the level of species-to-species correlation,</w:t>
       </w:r>
@@ -10342,7 +10562,7 @@
         <w:t xml:space="preserve">.</w:t>
       </w:r>
     </w:p>
-    <w:bookmarkEnd w:id="122"/>
+    <w:bookmarkEnd w:id="124"/>
     <w:sectPr>
       <w:footerReference r:id="rId9" w:type="default"/>
       <w:pgSz w:h="15840" w:w="12240"/>

</xml_diff>

<commit_message>
Integrate latest edits from co-authors
</commit_message>
<xml_diff>
--- a/analysis/paper/_book/ms.docx
+++ b/analysis/paper/_book/ms.docx
@@ -73,7 +73,7 @@
         <w:br/>
       </w:r>
       <w:r>
-        <w:t xml:space="preserve">2025-09-03</w:t>
+        <w:t xml:space="preserve">2025-09-15</w:t>
       </w:r>
     </w:p>
     <w:p>
@@ -204,7 +204,7 @@
         <w:t xml:space="preserve">)</w:t>
       </w:r>
       <w:r>
-        <w:t xml:space="preserve">. These ideas are exemplified by the use of maximum sustainable yield (MSY) in the classic single-species surplus production modeling framework</w:t>
+        <w:t xml:space="preserve">. These ideas are exemplified by the concept of maximum sustainable yield (MSY) in the classic single-species surplus production modeling framework</w:t>
       </w:r>
       <w:r>
         <w:t xml:space="preserve"> </w:t>
@@ -418,7 +418,7 @@
         <w:t xml:space="preserve">)</w:t>
       </w:r>
       <w:r>
-        <w:t xml:space="preserve">. However, the application of these approaches to fisheries management have often been hindered by data limitations (e.g., age data are frequently not available) and knowledge gaps (e.g., incomplete understanding of food-web interactions). There is therefore a need for methods to help bridge the gap between single-species and multispecies assessment in data or information poor systems.</w:t>
+        <w:t xml:space="preserve">. However, application of these approaches to fisheries management have often been hindered by data limitations (e.g., age data are frequently not available) and knowledge gaps (e.g., incomplete understanding of food-web interactions). There is therefore a need for methods to help bridge the gap between single-species and multispecies assessment in data or information poor circumstances.</w:t>
       </w:r>
     </w:p>
     <w:p>
@@ -2112,7 +2112,7 @@
         <w:pStyle w:val="FirstParagraph"/>
       </w:pPr>
       <w:r>
-        <w:t xml:space="preserve">The inclusion of multiple species in the model permits the estimation of covariance. While covarying changes may arise from the observation process, we assume that most covariance stems from ecosystem processes. We therefore treat observation errors as independent and normally distributed deviations such that</w:t>
+        <w:t xml:space="preserve">One simplifying assumption of this formulation is that each unit of biomass, regardless of species, contributes equally to limiting the realized growth of any given species. This assumption is partially relaxed through the covariance structure, which allows positive or negative associations among species beyond the shared carrying capacity. Though such associations may arise from the observation process, we assume that most covariance stems from ecosystem processes. We therefore treat observation errors as independent and normally distributed deviations such that</w:t>
       </w:r>
       <w:r>
         <w:t xml:space="preserve"> </w:t>
@@ -2231,7 +2231,15 @@
         <w:t xml:space="preserve"> </w:t>
       </w:r>
       <w:r>
-        <w:t xml:space="preserve">represents species- and survey-specific levels of observation error. A more flexible error structure is used to describe the process errors to account for temporal dependencies driven by ecological processes. For instance, species interactions may drive positive or negative population responses resulting from direct or indirect associations. Deviations from expected production may also display temporal dependence if the factors contributing to the process errors change gradually over time. Such inertia may cause positive or negative process errors to persist across several years. A first-order autoregressive (AR1) process was therefore applied to account for temporal dependence. Both sources of dependence are modeled using a multivariate AR1 process where</w:t>
+        <w:t xml:space="preserve">represents species- and survey-specific levels of observation error.</w:t>
+      </w:r>
+    </w:p>
+    <w:p>
+      <w:pPr>
+        <w:pStyle w:val="BodyText"/>
+      </w:pPr>
+      <w:r>
+        <w:t xml:space="preserve">To account for temporal dependencies driven by ecological processes, a more flexible error structure is used to describe the process errors. Species interactions may drive positive or negative population responses resulting from direct or indirect associations. Deviations from expected production may also display temporal dependence if the factors contributing to the process errors change gradually over time. Such inertia may cause positive or negative process errors to persist over several years. A first-order autoregressive (AR1) process was therefore applied to account for temporal dependence. Both sources of dependence are modeled using a multivariate AR1 process where</w:t>
       </w:r>
     </w:p>
     <w:p>
@@ -2831,7 +2839,7 @@
         <w:t xml:space="preserve"> </w:t>
       </w:r>
       <w:r>
-        <w:t xml:space="preserve">indicate strong persistence. Although different species may in reality exhibit different levels of temporal correlation, a single</w:t>
+        <w:t xml:space="preserve">indicate strong persistence. Although different species may exhibit different levels of temporal correlation, a single</w:t>
       </w:r>
       <w:r>
         <w:t xml:space="preserve"> </w:t>
@@ -4065,7 +4073,7 @@
         <w:t xml:space="preserve">)</w:t>
       </w:r>
       <w:r>
-        <w:t xml:space="preserve">. The formulation was also modified to fit the single-species Schaefer production function by dropping the summation of biomass in equation (5) and estimating species-specific carrying capacities,</w:t>
+        <w:t xml:space="preserve">. Equation (5) was also modified to enable the fitting of a single-species Schaefer production function by dropping the summation of biomass and estimating species-specific carrying capacities,</w:t>
       </w:r>
       <w:r>
         <w:t xml:space="preserve"> </w:t>
@@ -4085,7 +4093,7 @@
         </m:sSub>
       </m:oMath>
       <w:r>
-        <w:t xml:space="preserve">, rather than a system level carrying capacity,</w:t>
+        <w:t xml:space="preserve">, rather than a system-level carrying capacity,</w:t>
       </w:r>
       <w:r>
         <w:t xml:space="preserve"> </w:t>
@@ -4108,7 +4116,7 @@
         <w:t xml:space="preserve"> </w:t>
       </w:r>
       <w:r>
-        <w:t xml:space="preserve">(i.e., apply equation (3) indexed by species).</w:t>
+        <w:t xml:space="preserve">(i.e., applying equation (3) separately to each species).</w:t>
       </w:r>
     </w:p>
     <w:bookmarkEnd w:id="22"/>
@@ -4226,7 +4234,7 @@
         <w:t xml:space="preserve">)</w:t>
       </w:r>
       <w:r>
-        <w:t xml:space="preserve">, both frequentist and Bayesian inference of model parameters are possible. In development, we found that estimation of parameters was generally more successful when vaguely informative priors were specified, and in some cases, not estimatable when unconstrained.</w:t>
+        <w:t xml:space="preserve">, both frequentist and Bayesian inference of model parameters are possible. In development, we found that estimation of parameters was generally more successful when vaguely informative priors were specified, and in some cases, not estimable when unconstrained.</w:t>
       </w:r>
     </w:p>
     <w:bookmarkEnd w:id="23"/>
@@ -4391,7 +4399,7 @@
         <w:t xml:space="preserve">)</w:t>
       </w:r>
       <w:r>
-        <w:t xml:space="preserve">. Within each era of the survey (Yankee, Engel, or Campelen) and for each season and region, samples used in this study were limited to strata that were covered most years (&gt; 80%) and to species found across more than 10% of these core strata. This often resulted in the exclusion of strata &gt;750 m as these areas have been inconsistently covered by the survey. Stratified analyses</w:t>
+        <w:t xml:space="preserve">. Within each era of the survey (Yankee, Engel, or Campelen) and for each season and region, samples used in this study were limited to strata that were sampled most years (&gt; 80%) and to species found across more than 10% of these core strata. This often resulted in the exclusion of strata &gt;750 m because these areas have been inconsistently sampled by the survey. Stratified analyses</w:t>
       </w:r>
       <w:r>
         <w:t xml:space="preserve"> </w:t>
@@ -6688,7 +6696,7 @@
         <w:t xml:space="preserve"> </w:t>
       </w:r>
       <w:r>
-        <w:t xml:space="preserve">in log-space. Rather than treat the estimates of survey CV as a perfect indicator of total observation error, the prior was widened by multiplying the standard deviation of log CV by two to account for observation variance introduced by potential distributional shifts outside of the survey domain. Another two times multiplier was applied for deep-water species as they have more scope for shifting outside the survey domain.</w:t>
+        <w:t xml:space="preserve">in log-space. Rather than treat the estimates of survey CV as a perfect indicator of total observation error, the prior was widened by multiplying the standard deviation of log CV by two to account for observation variance introduced by potential distributional shifts outside of the survey domain. Another two-time multiplier was applied for deep-water species because they have more scope for shifting outside the survey domain.</w:t>
       </w:r>
     </w:p>
     <w:bookmarkEnd w:id="29"/>
@@ -6707,7 +6715,7 @@
         <w:pStyle w:val="FirstParagraph"/>
       </w:pPr>
       <w:r>
-        <w:t xml:space="preserve">The degree to which density-dependence of the demersal fish community inhabiting the NL shelves is driven by intra versus interspecific competition is unknown. Nor is the degree to which species interactions affect population dynamics. It is, however, well known that the community has been fished for more than 500 years and this history was punctuated by a collapse of several stocks, most notably cod, in the early 1990s</w:t>
+        <w:t xml:space="preserve">The degree to which density-dependence of the demersal fish community inhabiting the NL shelves is driven by intra versus interspecific competition is unknown. Nor is the degree to which species interactions affect population dynamics. It is, however, well known that the community has been exploited for more than 500 years and this history was punctuated by a collapse of several stocks, most notably cod, in the early 1990s</w:t>
       </w:r>
       <w:r>
         <w:t xml:space="preserve"> </w:t>
@@ -6877,7 +6885,7 @@
         <w:t xml:space="preserve"> </w:t>
       </w:r>
       <w:r>
-        <w:t xml:space="preserve">model, except species by species correlations in the process errors are assumed to be the same across all pairs. This structure implies that there is a common but unknown environmental variable affecting the population dynamics of all species. The shift covariate was not applied.</w:t>
+        <w:t xml:space="preserve">model, except species-by-species correlations in the process errors are assumed to be the same across all pairs. This structure implies that there is a common but unknown environmental variable affecting the population dynamics of all species. The shift covariate was not applied.</w:t>
       </w:r>
     </w:p>
     <w:p>
@@ -6958,7 +6966,7 @@
         <w:t xml:space="preserve"> </w:t>
       </w:r>
       <w:r>
-        <w:t xml:space="preserve">model, except species by species correlations are assumed to be</w:t>
+        <w:t xml:space="preserve">model, except species-by-species correlations are assumed to be</w:t>
       </w:r>
       <w:r>
         <w:t xml:space="preserve"> </w:t>
@@ -7063,7 +7071,7 @@
         <w:pStyle w:val="BodyText"/>
       </w:pPr>
       <w:r>
-        <w:t xml:space="preserve">The predictive ability of each of these models was tested using two cross-validation approaches: 1) leave-one-out cross-validation (LOO-CV), and 2) hindcast cross-validation (Hindcast-CV). LOO-CV is a form of exhaustive cross-validation where the model is repeatedly conditioned on a training set missing one observation (i.e., one fold) until the number of model folds equal the number of observations in the data. The missing observations are predicted at each fold, permitting assessments of the models’ ability to predict the actual value that was left-out at each fold. The hindcast-CV approach is similar, however it focuses on the models’ ability to predict the future. Under this approach, the model is repeatedly conditioned on a training set missing observations from the terminal year such that each fold excludes an increasing number of years worth of data from the tail of the time series</w:t>
+        <w:t xml:space="preserve">The predictive ability of each of these models was tested using two cross-validation approaches: 1) leave-one-out cross-validation (LOO-CV), and 2) hindcast cross-validation (Hindcast-CV). LOO-CV is a form of exhaustive cross-validation where the model is repeatedly conditioned on a training set missing one observation (i.e., one-fold) until the number of model folds equal the number of observations in the data. The missing observations are predicted at each fold, permitting assessments of the models’ ability to predict the actual value that was left-out at each fold. The hindcast-CV approach is similar, but it focuses on the models’ ability to predict the future. Under this approach, the model is repeatedly conditioned on a training set missing observations from the terminal year such that each fold excludes an increasing number of years worth of data from the tail of the time series</w:t>
       </w:r>
       <w:r>
         <w:t xml:space="preserve"> </w:t>
@@ -7113,7 +7121,7 @@
         <w:t xml:space="preserve"> </w:t>
       </w:r>
       <w:r>
-        <w:t xml:space="preserve">and the left out observations</w:t>
+        <w:t xml:space="preserve">and the left-out observations</w:t>
       </w:r>
       <w:r>
         <w:t xml:space="preserve"> </w:t>
@@ -7147,7 +7155,7 @@
         <w:t xml:space="preserve"> </w:t>
       </w:r>
       <w:r>
-        <w:t xml:space="preserve">represents all unique combinations of years, species, and survey indices present in the left out data. LOO-CV and Hindcast-CV prediction error scores for each model for each region were calculated by taking the mean squared error,</w:t>
+        <w:t xml:space="preserve">represents all unique combinations of years, species, and survey indices present in the left-out data. LOO-CV and Hindcast-CV prediction error scores for each model for each region were calculated by taking the mean squared error,</w:t>
       </w:r>
     </w:p>
     <w:p>
@@ -7554,7 +7562,7 @@
         <w:t xml:space="preserve">4</w:t>
       </w:r>
       <w:r>
-        <w:t xml:space="preserve">). Substantial additions occurred through the 1980s, followed by sharp subtractions in the early 1990s across all three ecosystem production units. On the Northeast NL Shelf, biomass exceeded the estimated carrying capacity through much of the 1980s, and residual subtractions exceeding 500 kt per year precede the abrupt declines of the early 1990s. Most species have since recovered on the Northeast NL Shelf, with total biomass approaching carrying capacity while community composition has remained largely unchanged. On the Grand Bank, total biomass only briefly exceeded carrying capacity in the 1980s and, following declines in the early 1990s, subsequent increases were dominated by Redfish spp. Off Southern NL, biomass remained below carrying capacity until the late 2010s, with smaller declines in the early 1990s and later increases largely driven by Redfish spp.</w:t>
+        <w:t xml:space="preserve">). Substantial additions occurred throughout the 1980s, followed by sharp subtractions in the early 1990s across all three ecosystem production units. On the Northeast NL Shelf, biomass exceeded the estimated carrying capacity throughout much of the 1980s, and residual subtractions exceeding 500 kt per year precede the abrupt declines of the early 1990s. Most species have since recovered on the Northeast NL Shelf, with total biomass approaching carrying capacity while community composition has remained largely unchanged. On the Grand Bank, total biomass only briefly exceeded carrying capacity in the 1980s and, following declines in the early 1990s, subsequent increases were dominated by Redfish spp. Off Southern NL, biomass remained below carrying capacity until the late 2010s, with smaller declines in the early 1990s and later increases largely driven by Redfish spp.</w:t>
       </w:r>
     </w:p>
     <w:p>
@@ -7745,7 +7753,14 @@
         <w:t xml:space="preserve"> </w:t>
       </w:r>
       <w:r>
-        <w:t xml:space="preserve">(sensu</w:t>
+        <w:t xml:space="preserve">(</w:t>
+      </w:r>
+      <w:r>
+        <w:rPr>
+          <w:i/>
+          <w:iCs/>
+        </w:rPr>
+        <w:t xml:space="preserve">sensu</w:t>
       </w:r>
       <w:r>
         <w:t xml:space="preserve"> </w:t>
@@ -7816,7 +7831,7 @@
         <w:t xml:space="preserve">)</w:t>
       </w:r>
       <w:r>
-        <w:t xml:space="preserve">, we attempt to differentiate population processes from noise and bias from surveys of fish populations. The overall structure of the model allows species-specific dynamics to be captured while avoiding the assumption that the dynamics of each species is isolated and independent from other species sharing the same space and potentially competing for the same resources.</w:t>
+        <w:t xml:space="preserve">, we attempt to differentiate population processes from noise and bias from surveys of fish populations. The overall structure of the model allows species-specific dynamics to be captured while avoiding the assumption that the dynamics of each species is isolated and independent from other species sharing the same ecosystem production unit and potentially competing for the same resources.</w:t>
       </w:r>
     </w:p>
     <w:p>
@@ -8223,7 +8238,35 @@
         <w:t xml:space="preserve">)</w:t>
       </w:r>
       <w:r>
-        <w:t xml:space="preserve">. While not a perfect test of chaotic dynamics, we did assess the possibility of a systematic shift in system-level carrying capacities and found little support for this hypothesis. That said, there were clear shifts in the communities in the region and these shifts may have emerged from the combined effects of interspecific competition and shifting energy pathways. It is well known that the dominant forage species in the area shifted from capelin to shrimp</w:t>
+        <w:t xml:space="preserve">. While not a perfect test of chaotic dynamics, we did assess the possibility of a systematic shift in system-level carrying capacities and found little support for this hypothesis.</w:t>
+      </w:r>
+    </w:p>
+    <w:p>
+      <w:pPr>
+        <w:pStyle w:val="BodyText"/>
+      </w:pPr>
+      <w:r>
+        <w:t xml:space="preserve">Although we found little support for a structural shift, clear changes in community structure were evident. These shifts may have emerged from the combined effects of ocean climate fluctuations</w:t>
+      </w:r>
+      <w:r>
+        <w:t xml:space="preserve"> </w:t>
+      </w:r>
+      <w:r>
+        <w:t xml:space="preserve">(</w:t>
+      </w:r>
+      <w:hyperlink w:anchor="ref-cyr2025">
+        <w:r>
+          <w:rPr>
+            <w:rStyle w:val="Hyperlink"/>
+          </w:rPr>
+          <w:t xml:space="preserve">Cyr et al., 2025</w:t>
+        </w:r>
+      </w:hyperlink>
+      <w:r>
+        <w:t xml:space="preserve">)</w:t>
+      </w:r>
+      <w:r>
+        <w:t xml:space="preserve">, interspecific competition, and shifting energy pathways. It is well known that the dominant forage species in the area shifted from capelin to shrimp</w:t>
       </w:r>
       <w:r>
         <w:t xml:space="preserve"> </w:t>
@@ -8317,7 +8360,7 @@
         <w:t xml:space="preserve">)</w:t>
       </w:r>
       <w:r>
-        <w:t xml:space="preserve">, so it is possible that the increasing shrimp population helped support concurrent recruitment pulses of redfish. We admit that this conjecture is highly speculative; however, we add it as a simple example of how bottom-up forces may be driving the observed changes in the community. The reality is obviously more complex and the observed restructuring of the communities may be akin to the</w:t>
+        <w:t xml:space="preserve">, so it is possible that the increasing shrimp population helped support concurrent recruitment pulses of redfish. We admit that this conjecture is speculative and acknowledge that the scale and dominance of redfish appears unrealistic; however, we add it as a simple example of how bottom-up forces may be driving the observed changes in the community. The reality is obviously more complex and the observed restructuring of the communities may be akin to the</w:t>
       </w:r>
       <w:r>
         <w:t xml:space="preserve"> </w:t>
@@ -8355,7 +8398,7 @@
         <w:t xml:space="preserve">)</w:t>
       </w:r>
       <w:r>
-        <w:t xml:space="preserve">.</w:t>
+        <w:t xml:space="preserve">. In any case, our results suggest that the observed productivity changes in these ecosystems may be better explained by underlying environmental drivers than by a sudden structural shift to an alternate stable state.</w:t>
       </w:r>
     </w:p>
     <w:p>
@@ -8420,7 +8463,30 @@
         <w:t xml:space="preserve">)</w:t>
       </w:r>
       <w:r>
-        <w:t xml:space="preserve">, which implies that the carrying capacity should be higher than estimated by the model presented here. Still, it is possible that the 1970s represents a period of unusually high productivity, where the system may have exceeded the carrying capacity.</w:t>
+        <w:t xml:space="preserve">, which implies that the carrying capacity should be higher than estimated by the model presented here. Still, it is possible that the 1970s represents a period of unusually high productivity, where the system may have exceeded the carrying capacity</w:t>
+      </w:r>
+      <w:r>
+        <w:t xml:space="preserve"> </w:t>
+      </w:r>
+      <w:r>
+        <w:t xml:space="preserve">(see also</w:t>
+      </w:r>
+      <w:r>
+        <w:t xml:space="preserve"> </w:t>
+      </w:r>
+      <w:hyperlink w:anchor="ref-cyr2025">
+        <w:r>
+          <w:rPr>
+            <w:rStyle w:val="Hyperlink"/>
+          </w:rPr>
+          <w:t xml:space="preserve">Cyr et al., 2025</w:t>
+        </w:r>
+      </w:hyperlink>
+      <w:r>
+        <w:t xml:space="preserve">)</w:t>
+      </w:r>
+      <w:r>
+        <w:t xml:space="preserve">. In our model, carrying capacity should be viewed as a long-term average, with environmental variability creating transient conditions that can raise or lower realized productivity.</w:t>
       </w:r>
     </w:p>
     <w:p>
@@ -8428,7 +8494,7 @@
         <w:pStyle w:val="BodyText"/>
       </w:pPr>
       <w:r>
-        <w:t xml:space="preserve">Results from the Grand Bank and Southern NL also indicate that the demersal fish community is currently dominated by redfish and, consequently, the system appears to be approaching its carrying capacity. Though redfish are currently rebounding in parts of eastern Canada</w:t>
+        <w:t xml:space="preserve">Results from the Grand Bank and Southern NL also indicate that the demersal fish community is currently dominated by redfish and, consequently, the system’s biomass appears to be approaching its carrying capacity. Though redfish are currently rebounding in parts of eastern Canada</w:t>
       </w:r>
       <w:r>
         <w:t xml:space="preserve"> </w:t>
@@ -8448,7 +8514,7 @@
         <w:t xml:space="preserve">)</w:t>
       </w:r>
       <w:r>
-        <w:t xml:space="preserve">, the implication that it dominates the benthic community seems unrealistic. This result may be an artifact of low estimates of survey catchability or the model’s inability to properly account for year effects. Observation errors are assumed to be lognormally distributed, however, extreme catch events / black swan events in space can introduce</w:t>
+        <w:t xml:space="preserve">, the implication that they dominate the demersal community seems unrealistic. This may be an artifact of low estimates of survey catchability or the model’s inability to properly account for year effects. Observation errors are assumed to be lognormally distributed; however, extreme catch events or black swan events in space can introduce</w:t>
       </w:r>
       <w:r>
         <w:t xml:space="preserve"> </w:t>
@@ -8460,7 +8526,7 @@
         <w:t xml:space="preserve"> </w:t>
       </w:r>
       <w:r>
-        <w:t xml:space="preserve">that may be better accounted for by assuming a distribution with heavier tails, such as the t-distribution</w:t>
+        <w:t xml:space="preserve">that may be better captured by a distribution with heavier tails, such as the t-distribution</w:t>
       </w:r>
       <w:r>
         <w:t xml:space="preserve"> </w:t>
@@ -8480,7 +8546,7 @@
         <w:t xml:space="preserve">)</w:t>
       </w:r>
       <w:r>
-        <w:t xml:space="preserve">.</w:t>
+        <w:t xml:space="preserve">. It is also possible that treating all species’ biomass as equivalent in limiting growth has inflated the apparent role of redfish. This highlights the need to better evaluate how species differ in their contributions to density-dependence.</w:t>
       </w:r>
     </w:p>
     <w:p>
@@ -8488,13 +8554,23 @@
         <w:pStyle w:val="BodyText"/>
       </w:pPr>
       <w:r>
-        <w:t xml:space="preserve">Despite these limitations, the approach retains practical value because it relies on inputs that are routinely collected in many regions (fishery‐independent surveys and landings), making it broadly applicable in data-limited contexts. In turn, the multispecies production framework provides management-relevant outputs for ecosystem-based fisheries management (EBFM): it estimates community-level constraints (shared carrying capacity) and cross-species coherence, which can be used to design reference points and harvest control rules that recognize system-level limits and trade-offs among species</w:t>
+        <w:t xml:space="preserve">Despite these limitations, the approach holds practical value because it relies on inputs that are routinely collected in many regions (fishery‐independent surveys and landings), making it broadly applicable in data-limited contexts. In turn, the multispecies production framework provides management-relevant outputs for ecosystem-based fisheries management (EBFM): it estimates community-level constraints (shared carrying capacity) and cross-species coherence, which can be used to design reference points and harvest control rules that recognize system-level limits and trade-offs among species</w:t>
       </w:r>
       <w:r>
         <w:t xml:space="preserve"> </w:t>
       </w:r>
       <w:r>
         <w:t xml:space="preserve">(</w:t>
+      </w:r>
+      <w:r>
+        <w:rPr>
+          <w:i/>
+          <w:iCs/>
+        </w:rPr>
+        <w:t xml:space="preserve">sensu</w:t>
+      </w:r>
+      <w:r>
+        <w:t xml:space="preserve"> </w:t>
       </w:r>
       <w:hyperlink w:anchor="ref-moffitt2016">
         <w:r>
@@ -8505,7 +8581,7 @@
         </w:r>
       </w:hyperlink>
       <w:r>
-        <w:t xml:space="preserve">; sensu</w:t>
+        <w:t xml:space="preserve">;</w:t>
       </w:r>
       <w:r>
         <w:t xml:space="preserve"> </w:t>
@@ -8522,7 +8598,69 @@
         <w:t xml:space="preserve">)</w:t>
       </w:r>
       <w:r>
-        <w:t xml:space="preserve">. When residual dynamics become more synchronous, managers can apply stronger precautionary buffers to account for weaker portfolio effects</w:t>
+        <w:t xml:space="preserve">. This type of applications could complement the ecosystem reference point-based framework currently implemented in NAFO to inform on the risk of ecosystem overfishing</w:t>
+      </w:r>
+      <w:r>
+        <w:t xml:space="preserve"> </w:t>
+      </w:r>
+      <w:r>
+        <w:t xml:space="preserve">(</w:t>
+      </w:r>
+      <w:hyperlink w:anchor="ref-koenalonso2022">
+        <w:r>
+          <w:rPr>
+            <w:rStyle w:val="Hyperlink"/>
+          </w:rPr>
+          <w:t xml:space="preserve">Koen-Alonso et al., 2022</w:t>
+        </w:r>
+      </w:hyperlink>
+      <w:r>
+        <w:t xml:space="preserve">;</w:t>
+      </w:r>
+      <w:r>
+        <w:t xml:space="preserve"> </w:t>
+      </w:r>
+      <w:hyperlink w:anchor="ref-nafo2022a">
+        <w:r>
+          <w:rPr>
+            <w:rStyle w:val="Hyperlink"/>
+          </w:rPr>
+          <w:t xml:space="preserve">NAFO, 2022a</w:t>
+        </w:r>
+      </w:hyperlink>
+      <w:r>
+        <w:t xml:space="preserve">,</w:t>
+      </w:r>
+      <w:r>
+        <w:t xml:space="preserve"> </w:t>
+      </w:r>
+      <w:hyperlink w:anchor="ref-nafo2022b">
+        <w:r>
+          <w:rPr>
+            <w:rStyle w:val="Hyperlink"/>
+          </w:rPr>
+          <w:t xml:space="preserve">2022b</w:t>
+        </w:r>
+      </w:hyperlink>
+      <w:r>
+        <w:t xml:space="preserve">,</w:t>
+      </w:r>
+      <w:r>
+        <w:t xml:space="preserve"> </w:t>
+      </w:r>
+      <w:hyperlink w:anchor="ref-nafo2022c">
+        <w:r>
+          <w:rPr>
+            <w:rStyle w:val="Hyperlink"/>
+          </w:rPr>
+          <w:t xml:space="preserve">2022c</w:t>
+        </w:r>
+      </w:hyperlink>
+      <w:r>
+        <w:t xml:space="preserve">)</w:t>
+      </w:r>
+      <w:r>
+        <w:t xml:space="preserve">. When residual dynamics become more synchronous, managers can apply stronger precautionary buffers to account for weakened portfolio effects</w:t>
       </w:r>
       <w:r>
         <w:t xml:space="preserve"> </w:t>
@@ -8733,11 +8871,11 @@
         <w:pStyle w:val="FirstParagraph"/>
       </w:pPr>
       <w:r>
-        <w:t xml:space="preserve">We thank the many ship’s crew and research staff involved in leading the surveys and collecting the data used in this study. These surveys were supported by Fisheries and Oceans Canada (DFO). An earlier draft version of the abstract, introduction, and discussion sections were written with the assistance of ChatGPT (March 14, 2023 version).</w:t>
+        <w:t xml:space="preserve">We thank the many ships’ crew and research staff involved in leading the surveys and collecting the data used in this study. These surveys were supported by Fisheries and Oceans Canada (DFO). An earlier draft version of the abstract, introduction, and discussion sections were written with the assistance of ChatGPT (March 14, 2023 version).</w:t>
       </w:r>
     </w:p>
     <w:bookmarkEnd w:id="39"/>
-    <w:bookmarkStart w:id="103" w:name="references"/>
+    <w:bookmarkStart w:id="108" w:name="references"/>
     <w:p>
       <w:pPr>
         <w:pStyle w:val="Heading1"/>
@@ -8746,7 +8884,7 @@
         <w:t xml:space="preserve">References</w:t>
       </w:r>
     </w:p>
-    <w:bookmarkStart w:id="102" w:name="refs"/>
+    <w:bookmarkStart w:id="107" w:name="refs"/>
     <w:bookmarkStart w:id="40" w:name="ref-albertsen2018"/>
     <w:p>
       <w:pPr>
@@ -9068,7 +9206,30 @@
       </w:r>
     </w:p>
     <w:bookmarkEnd w:id="50"/>
-    <w:bookmarkStart w:id="51" w:name="ref-dawe2012"/>
+    <w:bookmarkStart w:id="51" w:name="ref-cyr2025"/>
+    <w:p>
+      <w:pPr>
+        <w:pStyle w:val="Bibliography"/>
+      </w:pPr>
+      <w:r>
+        <w:t xml:space="preserve">Cyr, F., Adamack, A.T., Bélanger, D., Koen-Alonso, M., Mullowney, D., Murphy, H., Regular, P., Pepin, P., 2025. Environmental control on the productivity of a heavily fished ecosystem.</w:t>
+      </w:r>
+      <w:r>
+        <w:t xml:space="preserve"> </w:t>
+      </w:r>
+      <w:r>
+        <w:rPr>
+          <w:i/>
+          <w:iCs/>
+        </w:rPr>
+        <w:t xml:space="preserve">Nature Communications</w:t>
+      </w:r>
+      <w:r>
+        <w:t xml:space="preserve">, 16: 5277.</w:t>
+      </w:r>
+    </w:p>
+    <w:bookmarkEnd w:id="51"/>
+    <w:bookmarkStart w:id="52" w:name="ref-dawe2012"/>
     <w:p>
       <w:pPr>
         <w:pStyle w:val="Bibliography"/>
@@ -9090,8 +9251,8 @@
         <w:t xml:space="preserve">, 469: 233–248.</w:t>
       </w:r>
     </w:p>
-    <w:bookmarkEnd w:id="51"/>
-    <w:bookmarkStart w:id="52" w:name="ref-del2004"/>
+    <w:bookmarkEnd w:id="52"/>
+    <w:bookmarkStart w:id="53" w:name="ref-del2004"/>
     <w:p>
       <w:pPr>
         <w:pStyle w:val="Bibliography"/>
@@ -9113,8 +9274,8 @@
         <w:t xml:space="preserve">, 13: 485–495.</w:t>
       </w:r>
     </w:p>
-    <w:bookmarkEnd w:id="52"/>
-    <w:bookmarkStart w:id="53" w:name="ref-fogarty2012"/>
+    <w:bookmarkEnd w:id="53"/>
+    <w:bookmarkStart w:id="54" w:name="ref-fogarty2012"/>
     <w:p>
       <w:pPr>
         <w:pStyle w:val="Bibliography"/>
@@ -9136,8 +9297,8 @@
         <w:t xml:space="preserve">, 459: 247–258.</w:t>
       </w:r>
     </w:p>
-    <w:bookmarkEnd w:id="53"/>
-    <w:bookmarkStart w:id="54" w:name="ref-froese2017"/>
+    <w:bookmarkEnd w:id="54"/>
+    <w:bookmarkStart w:id="55" w:name="ref-froese2017"/>
     <w:p>
       <w:pPr>
         <w:pStyle w:val="Bibliography"/>
@@ -9159,8 +9320,8 @@
         <w:t xml:space="preserve">, 18: 506–526.</w:t>
       </w:r>
     </w:p>
-    <w:bookmarkEnd w:id="54"/>
-    <w:bookmarkStart w:id="55" w:name="ref-fulton2011"/>
+    <w:bookmarkEnd w:id="55"/>
+    <w:bookmarkStart w:id="56" w:name="ref-fulton2011"/>
     <w:p>
       <w:pPr>
         <w:pStyle w:val="Bibliography"/>
@@ -9182,8 +9343,8 @@
         <w:t xml:space="preserve">, 12: 171–188.</w:t>
       </w:r>
     </w:p>
-    <w:bookmarkEnd w:id="55"/>
-    <w:bookmarkStart w:id="56" w:name="ref-gamble2009"/>
+    <w:bookmarkEnd w:id="56"/>
+    <w:bookmarkStart w:id="57" w:name="ref-gamble2009"/>
     <w:p>
       <w:pPr>
         <w:pStyle w:val="Bibliography"/>
@@ -9205,8 +9366,8 @@
         <w:t xml:space="preserve">, 220: 2570–2582.</w:t>
       </w:r>
     </w:p>
-    <w:bookmarkEnd w:id="56"/>
-    <w:bookmarkStart w:id="57" w:name="ref-gomes1995"/>
+    <w:bookmarkEnd w:id="57"/>
+    <w:bookmarkStart w:id="58" w:name="ref-gomes1995"/>
     <w:p>
       <w:pPr>
         <w:pStyle w:val="Bibliography"/>
@@ -9228,8 +9389,8 @@
         <w:t xml:space="preserve">, 4: 85–101.</w:t>
       </w:r>
     </w:p>
-    <w:bookmarkEnd w:id="57"/>
-    <w:bookmarkStart w:id="58" w:name="ref-hilborn1995"/>
+    <w:bookmarkEnd w:id="58"/>
+    <w:bookmarkStart w:id="59" w:name="ref-hilborn1995"/>
     <w:p>
       <w:pPr>
         <w:pStyle w:val="Bibliography"/>
@@ -9251,8 +9412,8 @@
         <w:t xml:space="preserve">, 26: 45–67.</w:t>
       </w:r>
     </w:p>
-    <w:bookmarkEnd w:id="58"/>
-    <w:bookmarkStart w:id="59" w:name="ref-hutchings2021"/>
+    <w:bookmarkEnd w:id="59"/>
+    <w:bookmarkStart w:id="60" w:name="ref-hutchings2021"/>
     <w:p>
       <w:pPr>
         <w:pStyle w:val="Bibliography"/>
@@ -9261,8 +9422,8 @@
         <w:t xml:space="preserve">Hutchings, J.A., 2021. A primer of life histories: Ecology, evolution, and application. Oxford University Press.</w:t>
       </w:r>
     </w:p>
-    <w:bookmarkEnd w:id="59"/>
-    <w:bookmarkStart w:id="60" w:name="ref-hutchings1996"/>
+    <w:bookmarkEnd w:id="60"/>
+    <w:bookmarkStart w:id="61" w:name="ref-hutchings1996"/>
     <w:p>
       <w:pPr>
         <w:pStyle w:val="Bibliography"/>
@@ -9284,8 +9445,8 @@
         <w:t xml:space="preserve">, 53: 943–962.</w:t>
       </w:r>
     </w:p>
-    <w:bookmarkEnd w:id="60"/>
-    <w:bookmarkStart w:id="61" w:name="ref-kell2016"/>
+    <w:bookmarkEnd w:id="61"/>
+    <w:bookmarkStart w:id="62" w:name="ref-kell2016"/>
     <w:p>
       <w:pPr>
         <w:pStyle w:val="Bibliography"/>
@@ -9307,8 +9468,8 @@
         <w:t xml:space="preserve">, 183: 119–127.</w:t>
       </w:r>
     </w:p>
-    <w:bookmarkEnd w:id="61"/>
-    <w:bookmarkStart w:id="62" w:name="ref-koen2021"/>
+    <w:bookmarkEnd w:id="62"/>
+    <w:bookmarkStart w:id="63" w:name="ref-koen2021"/>
     <w:p>
       <w:pPr>
         <w:pStyle w:val="Bibliography"/>
@@ -9330,8 +9491,31 @@
         <w:t xml:space="preserve">, 8: 579946.</w:t>
       </w:r>
     </w:p>
-    <w:bookmarkEnd w:id="62"/>
-    <w:bookmarkStart w:id="64" w:name="ref-kristensen2015"/>
+    <w:bookmarkEnd w:id="63"/>
+    <w:bookmarkStart w:id="64" w:name="ref-koenalonso2022"/>
+    <w:p>
+      <w:pPr>
+        <w:pStyle w:val="Bibliography"/>
+      </w:pPr>
+      <w:r>
+        <w:t xml:space="preserve">Koen-Alonso, M., Pepin, P., Fogarty, M., Gamble, R., 2022. Review and assessment of the ecosystem production potential (EPP) model structure, sensitivity, and its use for fisheries advice in NAFO.</w:t>
+      </w:r>
+      <w:r>
+        <w:t xml:space="preserve"> </w:t>
+      </w:r>
+      <w:r>
+        <w:rPr>
+          <w:i/>
+          <w:iCs/>
+        </w:rPr>
+        <w:t xml:space="preserve">NAFO SCR Document</w:t>
+      </w:r>
+      <w:r>
+        <w:t xml:space="preserve">, 22/002: 1–52.</w:t>
+      </w:r>
+    </w:p>
+    <w:bookmarkEnd w:id="64"/>
+    <w:bookmarkStart w:id="66" w:name="ref-kristensen2015"/>
     <w:p>
       <w:pPr>
         <w:pStyle w:val="Bibliography"/>
@@ -9355,7 +9539,7 @@
       <w:r>
         <w:t xml:space="preserve"> </w:t>
       </w:r>
-      <w:hyperlink r:id="rId63">
+      <w:hyperlink r:id="rId65">
         <w:r>
           <w:rPr>
             <w:rStyle w:val="Hyperlink"/>
@@ -9364,8 +9548,8 @@
         </w:r>
       </w:hyperlink>
     </w:p>
-    <w:bookmarkEnd w:id="64"/>
-    <w:bookmarkStart w:id="65" w:name="ref-latour2003"/>
+    <w:bookmarkEnd w:id="66"/>
+    <w:bookmarkStart w:id="67" w:name="ref-latour2003"/>
     <w:p>
       <w:pPr>
         <w:pStyle w:val="Bibliography"/>
@@ -9387,8 +9571,8 @@
         <w:t xml:space="preserve">, 28: 10–22.</w:t>
       </w:r>
     </w:p>
-    <w:bookmarkEnd w:id="65"/>
-    <w:bookmarkStart w:id="66" w:name="ref-lear1998"/>
+    <w:bookmarkEnd w:id="67"/>
+    <w:bookmarkStart w:id="68" w:name="ref-lear1998"/>
     <w:p>
       <w:pPr>
         <w:pStyle w:val="Bibliography"/>
@@ -9410,8 +9594,8 @@
         <w:t xml:space="preserve">, 23.</w:t>
       </w:r>
     </w:p>
-    <w:bookmarkEnd w:id="66"/>
-    <w:bookmarkStart w:id="67" w:name="ref-licandeo2020"/>
+    <w:bookmarkEnd w:id="68"/>
+    <w:bookmarkStart w:id="69" w:name="ref-licandeo2020"/>
     <w:p>
       <w:pPr>
         <w:pStyle w:val="Bibliography"/>
@@ -9433,8 +9617,8 @@
         <w:t xml:space="preserve">, 77: 684–702.</w:t>
       </w:r>
     </w:p>
-    <w:bookmarkEnd w:id="67"/>
-    <w:bookmarkStart w:id="68" w:name="ref-link2019"/>
+    <w:bookmarkEnd w:id="69"/>
+    <w:bookmarkStart w:id="70" w:name="ref-link2019"/>
     <w:p>
       <w:pPr>
         <w:pStyle w:val="Bibliography"/>
@@ -9443,8 +9627,8 @@
         <w:t xml:space="preserve">Link, J., Sherwood, G., 2019. Feeding, growth, and trophic ecology., in: Rose, G.A. (Ed.), Atlantic Cod: A Bio-Ecology. John Wiley &amp; Sons, pp. 219–286.</w:t>
       </w:r>
     </w:p>
-    <w:bookmarkEnd w:id="68"/>
-    <w:bookmarkStart w:id="69" w:name="ref-lotka1925"/>
+    <w:bookmarkEnd w:id="70"/>
+    <w:bookmarkStart w:id="71" w:name="ref-lotka1925"/>
     <w:p>
       <w:pPr>
         <w:pStyle w:val="Bibliography"/>
@@ -9453,8 +9637,8 @@
         <w:t xml:space="preserve">Lotka, A.J., 1925. Elements of physical biology. Williams &amp; Wilkins.</w:t>
       </w:r>
     </w:p>
-    <w:bookmarkEnd w:id="69"/>
-    <w:bookmarkStart w:id="70" w:name="ref-millar2000"/>
+    <w:bookmarkEnd w:id="71"/>
+    <w:bookmarkStart w:id="72" w:name="ref-millar2000"/>
     <w:p>
       <w:pPr>
         <w:pStyle w:val="Bibliography"/>
@@ -9476,8 +9660,8 @@
         <w:t xml:space="preserve">, 49: 327–342.</w:t>
       </w:r>
     </w:p>
-    <w:bookmarkEnd w:id="70"/>
-    <w:bookmarkStart w:id="71" w:name="ref-moffitt2016"/>
+    <w:bookmarkEnd w:id="72"/>
+    <w:bookmarkStart w:id="73" w:name="ref-moffitt2016"/>
     <w:p>
       <w:pPr>
         <w:pStyle w:val="Bibliography"/>
@@ -9499,8 +9683,8 @@
         <w:t xml:space="preserve">, 134: 350–359.</w:t>
       </w:r>
     </w:p>
-    <w:bookmarkEnd w:id="71"/>
-    <w:bookmarkStart w:id="72" w:name="ref-montevecchi1997"/>
+    <w:bookmarkEnd w:id="73"/>
+    <w:bookmarkStart w:id="74" w:name="ref-montevecchi1997"/>
     <w:p>
       <w:pPr>
         <w:pStyle w:val="Bibliography"/>
@@ -9522,8 +9706,8 @@
         <w:t xml:space="preserve">, 54: 608–614.</w:t>
       </w:r>
     </w:p>
-    <w:bookmarkEnd w:id="72"/>
-    <w:bookmarkStart w:id="73" w:name="ref-morgan2002"/>
+    <w:bookmarkEnd w:id="74"/>
+    <w:bookmarkStart w:id="75" w:name="ref-morgan2002"/>
     <w:p>
       <w:pPr>
         <w:pStyle w:val="Bibliography"/>
@@ -9545,8 +9729,8 @@
         <w:t xml:space="preserve">, 57: 39–49.</w:t>
       </w:r>
     </w:p>
-    <w:bookmarkEnd w:id="73"/>
-    <w:bookmarkStart w:id="74" w:name="ref-mueter2006"/>
+    <w:bookmarkEnd w:id="75"/>
+    <w:bookmarkStart w:id="76" w:name="ref-mueter2006"/>
     <w:p>
       <w:pPr>
         <w:pStyle w:val="Bibliography"/>
@@ -9568,8 +9752,8 @@
         <w:t xml:space="preserve">, 81: 189–201.</w:t>
       </w:r>
     </w:p>
-    <w:bookmarkEnd w:id="74"/>
-    <w:bookmarkStart w:id="75" w:name="ref-mullowney2014"/>
+    <w:bookmarkEnd w:id="76"/>
+    <w:bookmarkStart w:id="77" w:name="ref-mullowney2014"/>
     <w:p>
       <w:pPr>
         <w:pStyle w:val="Bibliography"/>
@@ -9591,19 +9775,88 @@
         <w:t xml:space="preserve">, 71: 784–793.</w:t>
       </w:r>
     </w:p>
-    <w:bookmarkEnd w:id="75"/>
-    <w:bookmarkStart w:id="77" w:name="ref-nafo2019"/>
+    <w:bookmarkEnd w:id="77"/>
+    <w:bookmarkStart w:id="78" w:name="ref-nafo2022a"/>
     <w:p>
       <w:pPr>
         <w:pStyle w:val="Bibliography"/>
       </w:pPr>
       <w:r>
+        <w:t xml:space="preserve">NAFO, 2022a. Report of the NAFO commission and its subsidiary bodies (STACTIC and STACFAD), 44th annual meeting of NAFO, 19–23 september 2022, porto, portugal.</w:t>
+      </w:r>
+      <w:r>
+        <w:t xml:space="preserve"> </w:t>
+      </w:r>
+      <w:r>
+        <w:rPr>
+          <w:i/>
+          <w:iCs/>
+        </w:rPr>
+        <w:t xml:space="preserve">NAFO COM Document</w:t>
+      </w:r>
+      <w:r>
+        <w:t xml:space="preserve">, 22/27: 168.</w:t>
+      </w:r>
+    </w:p>
+    <w:bookmarkEnd w:id="78"/>
+    <w:bookmarkStart w:id="79" w:name="ref-nafo2022b"/>
+    <w:p>
+      <w:pPr>
+        <w:pStyle w:val="Bibliography"/>
+      </w:pPr>
+      <w:r>
+        <w:t xml:space="preserve">NAFO, 2022b. Report of the NAFO joint commission–scientific council working group on ecosystem approach framework to fisheries management (WG-EAFFM) meeting, 11–12 august 2022.</w:t>
+      </w:r>
+      <w:r>
+        <w:t xml:space="preserve"> </w:t>
+      </w:r>
+      <w:r>
+        <w:rPr>
+          <w:i/>
+          <w:iCs/>
+        </w:rPr>
+        <w:t xml:space="preserve">NAFO COM-SC Document</w:t>
+      </w:r>
+      <w:r>
+        <w:t xml:space="preserve">, 22-02: 1–22.</w:t>
+      </w:r>
+    </w:p>
+    <w:bookmarkEnd w:id="79"/>
+    <w:bookmarkStart w:id="80" w:name="ref-nafo2022c"/>
+    <w:p>
+      <w:pPr>
+        <w:pStyle w:val="Bibliography"/>
+      </w:pPr>
+      <w:r>
+        <w:t xml:space="preserve">NAFO, 2022c. Report of the scientific council meeting, 03–16 june 2022.</w:t>
+      </w:r>
+      <w:r>
+        <w:t xml:space="preserve"> </w:t>
+      </w:r>
+      <w:r>
+        <w:rPr>
+          <w:i/>
+          <w:iCs/>
+        </w:rPr>
+        <w:t xml:space="preserve">NAFO SCS Document</w:t>
+      </w:r>
+      <w:r>
+        <w:t xml:space="preserve">, 22/18: 241.</w:t>
+      </w:r>
+    </w:p>
+    <w:bookmarkEnd w:id="80"/>
+    <w:bookmarkStart w:id="82" w:name="ref-nafo2019"/>
+    <w:p>
+      <w:pPr>
+        <w:pStyle w:val="Bibliography"/>
+      </w:pPr>
+      <w:r>
         <w:t xml:space="preserve">NAFO, 2019.</w:t>
       </w:r>
       <w:r>
         <w:t xml:space="preserve"> </w:t>
       </w:r>
-      <w:hyperlink r:id="rId76">
+      <w:hyperlink r:id="rId81">
         <w:r>
           <w:rPr>
             <w:rStyle w:val="Hyperlink"/>
@@ -9628,8 +9881,8 @@
         <w:t xml:space="preserve">, 19/20.</w:t>
       </w:r>
     </w:p>
-    <w:bookmarkEnd w:id="77"/>
-    <w:bookmarkStart w:id="78" w:name="ref-patrick2015"/>
+    <w:bookmarkEnd w:id="82"/>
+    <w:bookmarkStart w:id="83" w:name="ref-patrick2015"/>
     <w:p>
       <w:pPr>
         <w:pStyle w:val="Bibliography"/>
@@ -9651,8 +9904,8 @@
         <w:t xml:space="preserve">, 40: 155–160.</w:t>
       </w:r>
     </w:p>
-    <w:bookmarkEnd w:id="78"/>
-    <w:bookmarkStart w:id="79" w:name="ref-pauly2021"/>
+    <w:bookmarkEnd w:id="83"/>
+    <w:bookmarkStart w:id="84" w:name="ref-pauly2021"/>
     <w:p>
       <w:pPr>
         <w:pStyle w:val="Bibliography"/>
@@ -9674,8 +9927,8 @@
         <w:t xml:space="preserve">, 78: 2204–2210.</w:t>
       </w:r>
     </w:p>
-    <w:bookmarkEnd w:id="79"/>
-    <w:bookmarkStart w:id="80" w:name="ref-pedersen2017"/>
+    <w:bookmarkEnd w:id="84"/>
+    <w:bookmarkStart w:id="85" w:name="ref-pedersen2017"/>
     <w:p>
       <w:pPr>
         <w:pStyle w:val="Bibliography"/>
@@ -9697,8 +9950,8 @@
         <w:t xml:space="preserve">, 4: 170215.</w:t>
       </w:r>
     </w:p>
-    <w:bookmarkEnd w:id="80"/>
-    <w:bookmarkStart w:id="81" w:name="ref-pepin2014"/>
+    <w:bookmarkEnd w:id="85"/>
+    <w:bookmarkStart w:id="86" w:name="ref-pepin2014"/>
     <w:p>
       <w:pPr>
         <w:pStyle w:val="Bibliography"/>
@@ -9741,8 +9994,8 @@
         <w:t xml:space="preserve">, 14: 069.</w:t>
       </w:r>
     </w:p>
-    <w:bookmarkEnd w:id="81"/>
-    <w:bookmarkStart w:id="82" w:name="ref-pikitch2004"/>
+    <w:bookmarkEnd w:id="86"/>
+    <w:bookmarkStart w:id="87" w:name="ref-pikitch2004"/>
     <w:p>
       <w:pPr>
         <w:pStyle w:val="Bibliography"/>
@@ -9751,8 +10004,8 @@
         <w:t xml:space="preserve">Pikitch, E.K., Santora, C., Babcock, E.A., Bakun, A., Bonfil, R., Conover, D.O., Dayton, P., Doukakis, P., Fluharty, D., Heneman, B., others, 2004. Ecosystem-based fishery management. Science.</w:t>
       </w:r>
     </w:p>
-    <w:bookmarkEnd w:id="82"/>
-    <w:bookmarkStart w:id="83" w:name="ref-pinsky2021"/>
+    <w:bookmarkEnd w:id="87"/>
+    <w:bookmarkStart w:id="88" w:name="ref-pinsky2021"/>
     <w:p>
       <w:pPr>
         <w:pStyle w:val="Bibliography"/>
@@ -9783,8 +10036,8 @@
         <w:t xml:space="preserve">, 118: e2025453118.</w:t>
       </w:r>
     </w:p>
-    <w:bookmarkEnd w:id="83"/>
-    <w:bookmarkStart w:id="85" w:name="ref-R"/>
+    <w:bookmarkEnd w:id="88"/>
+    <w:bookmarkStart w:id="90" w:name="ref-R"/>
     <w:p>
       <w:pPr>
         <w:pStyle w:val="Bibliography"/>
@@ -9795,7 +10048,7 @@
       <w:r>
         <w:t xml:space="preserve"> </w:t>
       </w:r>
-      <w:hyperlink r:id="rId84">
+      <w:hyperlink r:id="rId89">
         <w:r>
           <w:rPr>
             <w:rStyle w:val="Hyperlink"/>
@@ -9807,8 +10060,8 @@
         <w:t xml:space="preserve">. R Foundation for Statistical Computing, Vienna, Austria.</w:t>
       </w:r>
     </w:p>
-    <w:bookmarkEnd w:id="85"/>
-    <w:bookmarkStart w:id="87" w:name="ref-regular2022"/>
+    <w:bookmarkEnd w:id="90"/>
+    <w:bookmarkStart w:id="92" w:name="ref-regular2022"/>
     <w:p>
       <w:pPr>
         <w:pStyle w:val="Bibliography"/>
@@ -9829,7 +10082,7 @@
       <w:r>
         <w:t xml:space="preserve">, 247: 106180. https://doi.org/</w:t>
       </w:r>
-      <w:hyperlink r:id="rId86">
+      <w:hyperlink r:id="rId91">
         <w:r>
           <w:rPr>
             <w:rStyle w:val="Hyperlink"/>
@@ -9838,8 +10091,8 @@
         </w:r>
       </w:hyperlink>
     </w:p>
-    <w:bookmarkEnd w:id="87"/>
-    <w:bookmarkStart w:id="88" w:name="ref-robertson2021"/>
+    <w:bookmarkEnd w:id="92"/>
+    <w:bookmarkStart w:id="93" w:name="ref-robertson2021"/>
     <w:p>
       <w:pPr>
         <w:pStyle w:val="Bibliography"/>
@@ -9861,8 +10114,8 @@
         <w:t xml:space="preserve">, 11: 9513.</w:t>
       </w:r>
     </w:p>
-    <w:bookmarkEnd w:id="88"/>
-    <w:bookmarkStart w:id="89" w:name="ref-rose2004"/>
+    <w:bookmarkEnd w:id="93"/>
+    <w:bookmarkStart w:id="94" w:name="ref-rose2004"/>
     <w:p>
       <w:pPr>
         <w:pStyle w:val="Bibliography"/>
@@ -9910,8 +10163,8 @@
         <w:t xml:space="preserve">, 61: 1553–1557.</w:t>
       </w:r>
     </w:p>
-    <w:bookmarkEnd w:id="89"/>
-    <w:bookmarkStart w:id="90" w:name="ref-rose2000"/>
+    <w:bookmarkEnd w:id="94"/>
+    <w:bookmarkStart w:id="95" w:name="ref-rose2000"/>
     <w:p>
       <w:pPr>
         <w:pStyle w:val="Bibliography"/>
@@ -9943,8 +10196,8 @@
         <w:t xml:space="preserve">, 57: 644–663.</w:t>
       </w:r>
     </w:p>
-    <w:bookmarkEnd w:id="90"/>
-    <w:bookmarkStart w:id="91" w:name="ref-schaefer1954"/>
+    <w:bookmarkEnd w:id="95"/>
+    <w:bookmarkStart w:id="96" w:name="ref-schaefer1954"/>
     <w:p>
       <w:pPr>
         <w:pStyle w:val="Bibliography"/>
@@ -9966,8 +10219,8 @@
         <w:t xml:space="preserve">, 1: 23–56.</w:t>
       </w:r>
     </w:p>
-    <w:bookmarkEnd w:id="91"/>
-    <w:bookmarkStart w:id="92" w:name="ref-scheffer2015"/>
+    <w:bookmarkEnd w:id="96"/>
+    <w:bookmarkStart w:id="97" w:name="ref-scheffer2015"/>
     <w:p>
       <w:pPr>
         <w:pStyle w:val="Bibliography"/>
@@ -9989,8 +10242,8 @@
         <w:t xml:space="preserve">, 347: 1317–1319.</w:t>
       </w:r>
     </w:p>
-    <w:bookmarkEnd w:id="92"/>
-    <w:bookmarkStart w:id="93" w:name="ref-scheffer2003"/>
+    <w:bookmarkEnd w:id="97"/>
+    <w:bookmarkStart w:id="98" w:name="ref-scheffer2003"/>
     <w:p>
       <w:pPr>
         <w:pStyle w:val="Bibliography"/>
@@ -10012,8 +10265,8 @@
         <w:t xml:space="preserve">, 491: 9–18.</w:t>
       </w:r>
     </w:p>
-    <w:bookmarkEnd w:id="93"/>
-    <w:bookmarkStart w:id="94" w:name="ref-schijns2021"/>
+    <w:bookmarkEnd w:id="98"/>
+    <w:bookmarkStart w:id="99" w:name="ref-schijns2021"/>
     <w:p>
       <w:pPr>
         <w:pStyle w:val="Bibliography"/>
@@ -10035,8 +10288,8 @@
         <w:t xml:space="preserve">, 78: 2675–2683.</w:t>
       </w:r>
     </w:p>
-    <w:bookmarkEnd w:id="94"/>
-    <w:bookmarkStart w:id="95" w:name="ref-schindler2010"/>
+    <w:bookmarkEnd w:id="99"/>
+    <w:bookmarkStart w:id="100" w:name="ref-schindler2010"/>
     <w:p>
       <w:pPr>
         <w:pStyle w:val="Bibliography"/>
@@ -10058,8 +10311,8 @@
         <w:t xml:space="preserve">, 465: 609–612.</w:t>
       </w:r>
     </w:p>
-    <w:bookmarkEnd w:id="95"/>
-    <w:bookmarkStart w:id="96" w:name="ref-smith1981"/>
+    <w:bookmarkEnd w:id="100"/>
+    <w:bookmarkStart w:id="101" w:name="ref-smith1981"/>
     <w:p>
       <w:pPr>
         <w:pStyle w:val="Bibliography"/>
@@ -10077,8 +10330,8 @@
         <w:t xml:space="preserve">. Canadian Technical Report of Fisheries; Aquatic Sciences No. 1030.</w:t>
       </w:r>
     </w:p>
-    <w:bookmarkEnd w:id="96"/>
-    <w:bookmarkStart w:id="97" w:name="ref-templeman1962"/>
+    <w:bookmarkEnd w:id="101"/>
+    <w:bookmarkStart w:id="102" w:name="ref-templeman1962"/>
     <w:p>
       <w:pPr>
         <w:pStyle w:val="Bibliography"/>
@@ -10100,8 +10353,8 @@
         <w:t xml:space="preserve">, 3: 79–123.</w:t>
       </w:r>
     </w:p>
-    <w:bookmarkEnd w:id="97"/>
-    <w:bookmarkStart w:id="98" w:name="ref-thorson2020"/>
+    <w:bookmarkEnd w:id="102"/>
+    <w:bookmarkStart w:id="103" w:name="ref-thorson2020"/>
     <w:p>
       <w:pPr>
         <w:pStyle w:val="Bibliography"/>
@@ -10123,8 +10376,8 @@
         <w:t xml:space="preserve">, 21: 237–251.</w:t>
       </w:r>
     </w:p>
-    <w:bookmarkEnd w:id="98"/>
-    <w:bookmarkStart w:id="99" w:name="ref-volterra1926"/>
+    <w:bookmarkEnd w:id="103"/>
+    <w:bookmarkStart w:id="104" w:name="ref-volterra1926"/>
     <w:p>
       <w:pPr>
         <w:pStyle w:val="Bibliography"/>
@@ -10146,8 +10399,8 @@
         <w:t xml:space="preserve">, 118: 558–560.</w:t>
       </w:r>
     </w:p>
-    <w:bookmarkEnd w:id="99"/>
-    <w:bookmarkStart w:id="100" w:name="ref-walsh1992"/>
+    <w:bookmarkEnd w:id="104"/>
+    <w:bookmarkStart w:id="105" w:name="ref-walsh1992"/>
     <w:p>
       <w:pPr>
         <w:pStyle w:val="Bibliography"/>
@@ -10169,8 +10422,8 @@
         <w:t xml:space="preserve">, 12: 625–633.</w:t>
       </w:r>
     </w:p>
-    <w:bookmarkEnd w:id="100"/>
-    <w:bookmarkStart w:id="101" w:name="ref-winker2018"/>
+    <w:bookmarkEnd w:id="105"/>
+    <w:bookmarkStart w:id="106" w:name="ref-winker2018"/>
     <w:p>
       <w:pPr>
         <w:pStyle w:val="Bibliography"/>
@@ -10201,15 +10454,15 @@
         <w:t xml:space="preserve">, 204: 275–288.</w:t>
       </w:r>
     </w:p>
-    <w:bookmarkEnd w:id="101"/>
-    <w:bookmarkEnd w:id="102"/>
+    <w:bookmarkEnd w:id="106"/>
+    <w:bookmarkEnd w:id="107"/>
     <w:p>
       <w:r>
         <w:br w:type="page"/>
       </w:r>
     </w:p>
-    <w:bookmarkEnd w:id="103"/>
-    <w:bookmarkStart w:id="124" w:name="figures"/>
+    <w:bookmarkEnd w:id="108"/>
+    <w:bookmarkStart w:id="129" w:name="figures"/>
     <w:p>
       <w:pPr>
         <w:pStyle w:val="Heading1"/>
@@ -10227,18 +10480,18 @@
           <wp:inline>
             <wp:extent cx="3599999" cy="4092857"/>
             <wp:effectExtent b="0" l="0" r="0" t="0"/>
-            <wp:docPr descr="Fig 1: Map of Newfoundland and Labrador (NL) case study area showing the Northeast NL Shelf (purple), Grand Bank (green), and Southern NL (yellow) ecosystem production units." title="" id="105" name="Picture"/>
+            <wp:docPr descr="Fig 1: Map of Newfoundland and Labrador (NL) case study area showing the Northeast NL Shelf (purple), Grand Bank (green), and Southern NL (yellow) ecosystem production units." title="" id="110" name="Picture"/>
             <a:graphic>
               <a:graphicData uri="http://schemas.openxmlformats.org/drawingml/2006/picture">
                 <pic:pic>
                   <pic:nvPicPr>
-                    <pic:cNvPr descr="C:/Users/RegularP/Documents/PROJECTS/multispic/analysis/paper/figures/epu_map.png" id="106" name="Picture"/>
+                    <pic:cNvPr descr="C:/Users/RegularP/Documents/PROJECTS/multispic/analysis/paper/figures/epu_map.png" id="111" name="Picture"/>
                     <pic:cNvPicPr>
                       <a:picLocks noChangeArrowheads="1" noChangeAspect="1"/>
                     </pic:cNvPicPr>
                   </pic:nvPicPr>
                   <pic:blipFill>
-                    <a:blip r:embed="rId104"/>
+                    <a:blip r:embed="rId109"/>
                     <a:stretch>
                       <a:fillRect/>
                     </a:stretch>
@@ -10269,8 +10522,8 @@
       <w:pPr>
         <w:pStyle w:val="ImageCaption"/>
       </w:pPr>
-      <w:bookmarkStart w:id="107" w:name="fig:epu-map"/>
-      <w:bookmarkEnd w:id="107"/>
+      <w:bookmarkStart w:id="112" w:name="fig:epu-map"/>
+      <w:bookmarkEnd w:id="112"/>
       <w:r>
         <w:t xml:space="preserve">Fig 1: Map of Newfoundland and Labrador (NL) case study area showing the Northeast NL Shelf (purple), Grand Bank (green), and Southern NL (yellow) ecosystem production units.</w:t>
       </w:r>
@@ -10284,12 +10537,12 @@
           <wp:inline>
             <wp:extent cx="5943600" cy="2773680"/>
             <wp:effectExtent b="0" l="0" r="0" t="0"/>
-            <wp:docPr descr="Fig 2: LOO-CV and Hindcast-CV scores from a series of production model formulations of increasing complexity, from a single-species production model (“Single-species”) to a multispecies production model with a covariate effect and species and temporal correlations (“Full”), fit to seven species in three ecosystem production units (Northeast NL Shelf, Grand Bank, and Southern NL) off the east coast of Canada. Overall scores for each model across score type and ecosystem production unit are shown on the rightmost facet." title="" id="109" name="Picture"/>
+            <wp:docPr descr="Fig 2: LOO-CV and Hindcast-CV scores from a series of production model formulations of increasing complexity, from a single-species production model (“Single-species”) to a multispecies production model with a covariate effect and species and temporal correlations (“Full”), fit to seven species in three ecosystem production units (Northeast NL Shelf, Grand Bank, and Southern NL) off the east coast of Canada. Overall scores for each model across score type and ecosystem production unit are shown on the rightmost facet." title="" id="114" name="Picture"/>
             <a:graphic>
               <a:graphicData uri="http://schemas.openxmlformats.org/drawingml/2006/picture">
                 <pic:pic>
                   <pic:nvPicPr>
-                    <pic:cNvPr descr="C:/Users/RegularP/Documents/PROJECTS/multispic/analysis/paper/figures/scores.svg" id="110" name="Picture"/>
+                    <pic:cNvPr descr="C:/Users/RegularP/Documents/PROJECTS/multispic/analysis/paper/figures/scores.svg" id="115" name="Picture"/>
                     <pic:cNvPicPr>
                       <a:picLocks noChangeArrowheads="1" noChangeAspect="1"/>
                     </pic:cNvPicPr>
@@ -10301,7 +10554,7 @@
                           <a14:useLocalDpi xmlns:a14="http://schemas.microsoft.com/office/drawing/2010/main" val="0"/>
                         </a:ext>
                         <a:ext uri="{96DAC541-7B7A-43D3-8B79-37D633B846F1}">
-                          <asvg:svgBlip xmlns:asvg="http://schemas.microsoft.com/office/drawing/2016/SVG/main" r:embed="rId108"/>
+                          <asvg:svgBlip xmlns:asvg="http://schemas.microsoft.com/office/drawing/2016/SVG/main" r:embed="rId113"/>
                         </a:ext>
                       </a:extLst>
                     </a:blip>
@@ -10335,8 +10588,8 @@
       <w:pPr>
         <w:pStyle w:val="ImageCaption"/>
       </w:pPr>
-      <w:bookmarkStart w:id="111" w:name="fig:scores"/>
-      <w:bookmarkEnd w:id="111"/>
+      <w:bookmarkStart w:id="116" w:name="fig:scores"/>
+      <w:bookmarkEnd w:id="116"/>
       <w:r>
         <w:t xml:space="preserve">Fig 2: LOO-CV and Hindcast-CV scores from a series of production model formulations of increasing complexity, from a single-species production model (</w:t>
       </w:r>
@@ -10362,12 +10615,12 @@
           <wp:inline>
             <wp:extent cx="5943600" cy="4160520"/>
             <wp:effectExtent b="0" l="0" r="0" t="0"/>
-            <wp:docPr descr="Fig 3: Trends in survey indices (dots) along with predicted indices (thin lines) and model estimates of biomass from the best fitting multispecies production model (thick lines). Uncertainty in the biomass estimates are represented by 95% confidence intervals (shaded region). Results from three ecosystem production units (Northeast NL Shelf, Grand Bank, and Southern NL) off the east coast of Canada are presented. Though data from seven species were used in each region, the species facet is limited to four for simplicity. Differences in biomass estimates from the indices stem from differing survey catchability estimates. Note differences in scale across facets." title="" id="113" name="Picture"/>
+            <wp:docPr descr="Fig 3: Trends in survey indices (dots) along with predicted indices (thin lines) and model estimates of biomass from the best fitting multispecies production model (thick lines). Uncertainty in the biomass estimates are represented by 95% confidence intervals (shaded region). Results from three ecosystem production units (Northeast NL Shelf, Grand Bank, and Southern NL) off the east coast of Canada are presented. Though data from seven species were used in each region, the species facet is limited to four for simplicity. Differences in biomass estimates from the indices stem from differing survey catchability estimates. Note differences in scale across facets." title="" id="118" name="Picture"/>
             <a:graphic>
               <a:graphicData uri="http://schemas.openxmlformats.org/drawingml/2006/picture">
                 <pic:pic>
                   <pic:nvPicPr>
-                    <pic:cNvPr descr="C:/Users/RegularP/Documents/PROJECTS/multispic/analysis/paper/figures/survey_trends.svg" id="114" name="Picture"/>
+                    <pic:cNvPr descr="C:/Users/RegularP/Documents/PROJECTS/multispic/analysis/paper/figures/survey_trends.svg" id="119" name="Picture"/>
                     <pic:cNvPicPr>
                       <a:picLocks noChangeArrowheads="1" noChangeAspect="1"/>
                     </pic:cNvPicPr>
@@ -10379,7 +10632,7 @@
                           <a14:useLocalDpi xmlns:a14="http://schemas.microsoft.com/office/drawing/2010/main" val="0"/>
                         </a:ext>
                         <a:ext uri="{96DAC541-7B7A-43D3-8B79-37D633B846F1}">
-                          <asvg:svgBlip xmlns:asvg="http://schemas.microsoft.com/office/drawing/2016/SVG/main" r:embed="rId112"/>
+                          <asvg:svgBlip xmlns:asvg="http://schemas.microsoft.com/office/drawing/2016/SVG/main" r:embed="rId117"/>
                         </a:ext>
                       </a:extLst>
                     </a:blip>
@@ -10413,8 +10666,8 @@
       <w:pPr>
         <w:pStyle w:val="ImageCaption"/>
       </w:pPr>
-      <w:bookmarkStart w:id="115" w:name="fig:survey-trends"/>
-      <w:bookmarkEnd w:id="115"/>
+      <w:bookmarkStart w:id="120" w:name="fig:survey-trends"/>
+      <w:bookmarkEnd w:id="120"/>
       <w:r>
         <w:t xml:space="preserve">Fig 3: Trends in survey indices (dots) along with predicted indices (thin lines) and model estimates of biomass from the best fitting multispecies production model (thick lines). Uncertainty in the biomass estimates are represented by 95% confidence intervals (shaded region). Results from three ecosystem production units (Northeast NL Shelf, Grand Bank, and Southern NL) off the east coast of Canada are presented. Though data from seven species were used in each region, the species facet is limited to four for simplicity. Differences in biomass estimates from the indices stem from differing survey catchability estimates. Note differences in scale across facets.</w:t>
       </w:r>
@@ -10428,12 +10681,12 @@
           <wp:inline>
             <wp:extent cx="5943600" cy="4160520"/>
             <wp:effectExtent b="0" l="0" r="0" t="0"/>
-            <wp:docPr descr="Fig 4: Trends in biomass, expected production, reported landings, and residual change from the best fitting multispecies production model across three ecosystem production units (Northeast NL Shelf, Grand Bank, and Southern NL) off the east coast of Canada. Species-specific trends from a subset of species are shown along with totals including seven species. Expected production represents expected changes from intrinsic growth and density-dependence (i.e., change from the production equation) and residual change represent process errors not explained by the production equation or reported landings. Note difference in scale across facets." title="" id="117" name="Picture"/>
+            <wp:docPr descr="Fig 4: Trends in biomass, expected production, reported landings, and residual change from the best fitting multispecies production model across three ecosystem production units (Northeast NL Shelf, Grand Bank, and Southern NL) off the east coast of Canada. Species-specific trends from a subset of species are shown along with totals including seven species. Expected production represents expected changes from intrinsic growth and density-dependence (i.e., change from the production equation) and residual change represent process errors not explained by the production equation or reported landings. Note difference in scale across facets." title="" id="122" name="Picture"/>
             <a:graphic>
               <a:graphicData uri="http://schemas.openxmlformats.org/drawingml/2006/picture">
                 <pic:pic>
                   <pic:nvPicPr>
-                    <pic:cNvPr descr="C:/Users/RegularP/Documents/PROJECTS/multispic/analysis/paper/figures/pop_trends.svg" id="118" name="Picture"/>
+                    <pic:cNvPr descr="C:/Users/RegularP/Documents/PROJECTS/multispic/analysis/paper/figures/pop_trends.svg" id="123" name="Picture"/>
                     <pic:cNvPicPr>
                       <a:picLocks noChangeArrowheads="1" noChangeAspect="1"/>
                     </pic:cNvPicPr>
@@ -10445,7 +10698,7 @@
                           <a14:useLocalDpi xmlns:a14="http://schemas.microsoft.com/office/drawing/2010/main" val="0"/>
                         </a:ext>
                         <a:ext uri="{96DAC541-7B7A-43D3-8B79-37D633B846F1}">
-                          <asvg:svgBlip xmlns:asvg="http://schemas.microsoft.com/office/drawing/2016/SVG/main" r:embed="rId116"/>
+                          <asvg:svgBlip xmlns:asvg="http://schemas.microsoft.com/office/drawing/2016/SVG/main" r:embed="rId121"/>
                         </a:ext>
                       </a:extLst>
                     </a:blip>
@@ -10479,8 +10732,8 @@
       <w:pPr>
         <w:pStyle w:val="ImageCaption"/>
       </w:pPr>
-      <w:bookmarkStart w:id="119" w:name="fig:pop-trends"/>
-      <w:bookmarkEnd w:id="119"/>
+      <w:bookmarkStart w:id="124" w:name="fig:pop-trends"/>
+      <w:bookmarkEnd w:id="124"/>
       <w:r>
         <w:t xml:space="preserve">Fig 4: Trends in biomass, expected production, reported landings, and residual change from the best fitting multispecies production model across three ecosystem production units (Northeast NL Shelf, Grand Bank, and Southern NL) off the east coast of Canada. Species-specific trends from a subset of species are shown along with totals including seven species. Expected production represents expected changes from intrinsic growth and density-dependence (i.e., change from the production equation) and residual change represent process errors not explained by the production equation or reported landings. Note difference in scale across facets.</w:t>
       </w:r>
@@ -10494,12 +10747,12 @@
           <wp:inline>
             <wp:extent cx="5943600" cy="3200400"/>
             <wp:effectExtent b="0" l="0" r="0" t="0"/>
-            <wp:docPr descr="Fig 5: Trends (upper facet) and species-to-species correlations (lower facet) in standardized process errors from the best fitting multispecies production model applied to seven species within three ecosystem production units (Northeast NL Shelf, Grand Bank, and Southern NL) off the east coast of Canada. Process errors represent changes not explained by the production equation or reported landings. Points in the correlation plots are coloured and scaled by the level of species-to-species correlation, \rho." title="" id="121" name="Picture"/>
+            <wp:docPr descr="Fig 5: Trends (upper facet) and species-to-species correlations (lower facet) in standardized process errors from the best fitting multispecies production model applied to seven species within three ecosystem production units (Northeast NL Shelf, Grand Bank, and Southern NL) off the east coast of Canada. Process errors represent changes not explained by the production equation or reported landings. Points in the correlation plots are coloured and scaled by the level of species-to-species correlation, \rho." title="" id="126" name="Picture"/>
             <a:graphic>
               <a:graphicData uri="http://schemas.openxmlformats.org/drawingml/2006/picture">
                 <pic:pic>
                   <pic:nvPicPr>
-                    <pic:cNvPr descr="C:/Users/RegularP/Documents/PROJECTS/multispic/analysis/paper/figures/pe_cor.svg" id="122" name="Picture"/>
+                    <pic:cNvPr descr="C:/Users/RegularP/Documents/PROJECTS/multispic/analysis/paper/figures/pe_cor.svg" id="127" name="Picture"/>
                     <pic:cNvPicPr>
                       <a:picLocks noChangeArrowheads="1" noChangeAspect="1"/>
                     </pic:cNvPicPr>
@@ -10511,7 +10764,7 @@
                           <a14:useLocalDpi xmlns:a14="http://schemas.microsoft.com/office/drawing/2010/main" val="0"/>
                         </a:ext>
                         <a:ext uri="{96DAC541-7B7A-43D3-8B79-37D633B846F1}">
-                          <asvg:svgBlip xmlns:asvg="http://schemas.microsoft.com/office/drawing/2016/SVG/main" r:embed="rId120"/>
+                          <asvg:svgBlip xmlns:asvg="http://schemas.microsoft.com/office/drawing/2016/SVG/main" r:embed="rId125"/>
                         </a:ext>
                       </a:extLst>
                     </a:blip>
@@ -10545,8 +10798,8 @@
       <w:pPr>
         <w:pStyle w:val="ImageCaption"/>
       </w:pPr>
-      <w:bookmarkStart w:id="123" w:name="fig:pe-cor"/>
-      <w:bookmarkEnd w:id="123"/>
+      <w:bookmarkStart w:id="128" w:name="fig:pe-cor"/>
+      <w:bookmarkEnd w:id="128"/>
       <w:r>
         <w:t xml:space="preserve">Fig 5: Trends (upper facet) and species-to-species correlations (lower facet) in standardized process errors from the best fitting multispecies production model applied to seven species within three ecosystem production units (Northeast NL Shelf, Grand Bank, and Southern NL) off the east coast of Canada. Process errors represent changes not explained by the production equation or reported landings. Points in the correlation plots are coloured and scaled by the level of species-to-species correlation,</w:t>
       </w:r>
@@ -10562,7 +10815,7 @@
         <w:t xml:space="preserve">.</w:t>
       </w:r>
     </w:p>
-    <w:bookmarkEnd w:id="124"/>
+    <w:bookmarkEnd w:id="129"/>
     <w:sectPr>
       <w:footerReference r:id="rId9" w:type="default"/>
       <w:pgSz w:h="15840" w:w="12240"/>

</xml_diff>